<commit_message>
Shorten the project report and add a literature-review table.
Figure size and line spacing are reduced, and Chapter 2 now compares the cited work in one table.
</commit_message>
<xml_diff>
--- a/StreamScope-Project-Report.docx
+++ b/StreamScope-Project-Report.docx
@@ -305,7 +305,7 @@
     </w:p>
     <w:p>
       <w:pPr>
-        <w:spacing w:before="240" w:after="160" w:line="276" w:lineRule="auto"/>
+        <w:spacing w:before="160" w:after="80" w:line="240" w:lineRule="auto"/>
         <w:ind w:firstLine="0"/>
         <w:jc w:val="left"/>
       </w:pPr>
@@ -315,14 +315,14 @@
           <w:b/>
           <w:i w:val="0"/>
           <w:color w:val="000000"/>
-          <w:sz w:val="32"/>
+          <w:sz w:val="28"/>
         </w:rPr>
         <w:t>CONTENTS</w:t>
       </w:r>
     </w:p>
     <w:p>
       <w:pPr>
-        <w:spacing w:after="40" w:before="0" w:line="360" w:lineRule="auto"/>
+        <w:spacing w:after="40" w:before="0" w:line="259" w:lineRule="auto"/>
         <w:jc w:val="both"/>
       </w:pPr>
       <w:r>
@@ -338,7 +338,7 @@
     </w:p>
     <w:p>
       <w:pPr>
-        <w:spacing w:after="40" w:before="0" w:line="360" w:lineRule="auto"/>
+        <w:spacing w:after="40" w:before="0" w:line="259" w:lineRule="auto"/>
         <w:jc w:val="both"/>
       </w:pPr>
       <w:r>
@@ -354,7 +354,7 @@
     </w:p>
     <w:p>
       <w:pPr>
-        <w:spacing w:after="40" w:before="0" w:line="360" w:lineRule="auto"/>
+        <w:spacing w:after="40" w:before="0" w:line="259" w:lineRule="auto"/>
         <w:jc w:val="both"/>
       </w:pPr>
       <w:r>
@@ -370,7 +370,7 @@
     </w:p>
     <w:p>
       <w:pPr>
-        <w:spacing w:after="40" w:before="0" w:line="360" w:lineRule="auto"/>
+        <w:spacing w:after="40" w:before="0" w:line="259" w:lineRule="auto"/>
         <w:jc w:val="both"/>
       </w:pPr>
       <w:r>
@@ -386,7 +386,7 @@
     </w:p>
     <w:p>
       <w:pPr>
-        <w:spacing w:after="40" w:before="0" w:line="360" w:lineRule="auto"/>
+        <w:spacing w:after="40" w:before="0" w:line="259" w:lineRule="auto"/>
         <w:jc w:val="both"/>
       </w:pPr>
       <w:r>
@@ -402,7 +402,7 @@
     </w:p>
     <w:p>
       <w:pPr>
-        <w:spacing w:after="40" w:before="0" w:line="360" w:lineRule="auto"/>
+        <w:spacing w:after="40" w:before="0" w:line="259" w:lineRule="auto"/>
         <w:jc w:val="both"/>
       </w:pPr>
       <w:r>
@@ -418,7 +418,7 @@
     </w:p>
     <w:p>
       <w:pPr>
-        <w:spacing w:after="40" w:before="0" w:line="360" w:lineRule="auto"/>
+        <w:spacing w:after="40" w:before="0" w:line="259" w:lineRule="auto"/>
         <w:jc w:val="both"/>
       </w:pPr>
       <w:r>
@@ -434,7 +434,7 @@
     </w:p>
     <w:p>
       <w:pPr>
-        <w:spacing w:after="40" w:before="0" w:line="360" w:lineRule="auto"/>
+        <w:spacing w:after="40" w:before="0" w:line="259" w:lineRule="auto"/>
         <w:jc w:val="both"/>
       </w:pPr>
       <w:r>
@@ -450,7 +450,7 @@
     </w:p>
     <w:p>
       <w:pPr>
-        <w:spacing w:after="40" w:before="0" w:line="360" w:lineRule="auto"/>
+        <w:spacing w:after="40" w:before="0" w:line="259" w:lineRule="auto"/>
         <w:jc w:val="both"/>
       </w:pPr>
       <w:r>
@@ -466,7 +466,7 @@
     </w:p>
     <w:p>
       <w:pPr>
-        <w:spacing w:after="40" w:before="0" w:line="360" w:lineRule="auto"/>
+        <w:spacing w:after="40" w:before="0" w:line="259" w:lineRule="auto"/>
         <w:jc w:val="both"/>
       </w:pPr>
       <w:r>
@@ -482,7 +482,7 @@
     </w:p>
     <w:p>
       <w:pPr>
-        <w:spacing w:after="40" w:before="0" w:line="360" w:lineRule="auto"/>
+        <w:spacing w:after="40" w:before="0" w:line="259" w:lineRule="auto"/>
         <w:jc w:val="both"/>
       </w:pPr>
       <w:r>
@@ -498,7 +498,7 @@
     </w:p>
     <w:p>
       <w:pPr>
-        <w:spacing w:after="40" w:before="0" w:line="360" w:lineRule="auto"/>
+        <w:spacing w:after="40" w:before="0" w:line="259" w:lineRule="auto"/>
         <w:jc w:val="both"/>
       </w:pPr>
       <w:r>
@@ -514,7 +514,7 @@
     </w:p>
     <w:p>
       <w:pPr>
-        <w:spacing w:after="40" w:before="0" w:line="360" w:lineRule="auto"/>
+        <w:spacing w:after="40" w:before="0" w:line="259" w:lineRule="auto"/>
         <w:jc w:val="both"/>
       </w:pPr>
       <w:r>
@@ -530,7 +530,7 @@
     </w:p>
     <w:p>
       <w:pPr>
-        <w:spacing w:after="40" w:before="0" w:line="360" w:lineRule="auto"/>
+        <w:spacing w:after="40" w:before="0" w:line="259" w:lineRule="auto"/>
         <w:jc w:val="both"/>
       </w:pPr>
       <w:r>
@@ -546,7 +546,7 @@
     </w:p>
     <w:p>
       <w:pPr>
-        <w:spacing w:after="40" w:before="0" w:line="360" w:lineRule="auto"/>
+        <w:spacing w:after="40" w:before="0" w:line="259" w:lineRule="auto"/>
         <w:jc w:val="both"/>
       </w:pPr>
       <w:r>
@@ -562,7 +562,7 @@
     </w:p>
     <w:p>
       <w:pPr>
-        <w:spacing w:after="40" w:before="0" w:line="360" w:lineRule="auto"/>
+        <w:spacing w:after="40" w:before="0" w:line="259" w:lineRule="auto"/>
         <w:jc w:val="both"/>
       </w:pPr>
       <w:r>
@@ -578,7 +578,7 @@
     </w:p>
     <w:p>
       <w:pPr>
-        <w:spacing w:after="40" w:before="0" w:line="360" w:lineRule="auto"/>
+        <w:spacing w:after="40" w:before="0" w:line="259" w:lineRule="auto"/>
         <w:jc w:val="both"/>
       </w:pPr>
       <w:r>
@@ -594,7 +594,7 @@
     </w:p>
     <w:p>
       <w:pPr>
-        <w:spacing w:after="40" w:before="0" w:line="360" w:lineRule="auto"/>
+        <w:spacing w:after="40" w:before="0" w:line="259" w:lineRule="auto"/>
         <w:jc w:val="both"/>
       </w:pPr>
       <w:r>
@@ -610,7 +610,7 @@
     </w:p>
     <w:p>
       <w:pPr>
-        <w:spacing w:after="40" w:before="0" w:line="360" w:lineRule="auto"/>
+        <w:spacing w:after="40" w:before="0" w:line="259" w:lineRule="auto"/>
         <w:jc w:val="both"/>
       </w:pPr>
       <w:r>
@@ -631,7 +631,7 @@
     </w:p>
     <w:p>
       <w:pPr>
-        <w:spacing w:before="240" w:after="160" w:line="276" w:lineRule="auto"/>
+        <w:spacing w:before="160" w:after="80" w:line="240" w:lineRule="auto"/>
         <w:ind w:firstLine="0"/>
         <w:jc w:val="left"/>
       </w:pPr>
@@ -641,14 +641,14 @@
           <w:b/>
           <w:i w:val="0"/>
           <w:color w:val="000000"/>
-          <w:sz w:val="32"/>
+          <w:sz w:val="28"/>
         </w:rPr>
         <w:t>LIST OF FIGURES</w:t>
       </w:r>
     </w:p>
     <w:p>
       <w:pPr>
-        <w:spacing w:after="40" w:before="0" w:line="360" w:lineRule="auto"/>
+        <w:spacing w:after="40" w:before="0" w:line="259" w:lineRule="auto"/>
         <w:jc w:val="both"/>
       </w:pPr>
       <w:r>
@@ -664,7 +664,7 @@
     </w:p>
     <w:p>
       <w:pPr>
-        <w:spacing w:after="40" w:before="0" w:line="360" w:lineRule="auto"/>
+        <w:spacing w:after="40" w:before="0" w:line="259" w:lineRule="auto"/>
         <w:jc w:val="both"/>
       </w:pPr>
       <w:r>
@@ -680,7 +680,7 @@
     </w:p>
     <w:p>
       <w:pPr>
-        <w:spacing w:after="40" w:before="0" w:line="360" w:lineRule="auto"/>
+        <w:spacing w:after="40" w:before="0" w:line="259" w:lineRule="auto"/>
         <w:jc w:val="both"/>
       </w:pPr>
       <w:r>
@@ -696,7 +696,7 @@
     </w:p>
     <w:p>
       <w:pPr>
-        <w:spacing w:after="40" w:before="0" w:line="360" w:lineRule="auto"/>
+        <w:spacing w:after="40" w:before="0" w:line="259" w:lineRule="auto"/>
         <w:jc w:val="both"/>
       </w:pPr>
       <w:r>
@@ -712,7 +712,7 @@
     </w:p>
     <w:p>
       <w:pPr>
-        <w:spacing w:after="40" w:before="0" w:line="360" w:lineRule="auto"/>
+        <w:spacing w:after="40" w:before="0" w:line="259" w:lineRule="auto"/>
         <w:jc w:val="both"/>
       </w:pPr>
       <w:r>
@@ -728,7 +728,7 @@
     </w:p>
     <w:p>
       <w:pPr>
-        <w:spacing w:after="40" w:before="0" w:line="360" w:lineRule="auto"/>
+        <w:spacing w:after="40" w:before="0" w:line="259" w:lineRule="auto"/>
         <w:jc w:val="both"/>
       </w:pPr>
       <w:r>
@@ -744,7 +744,7 @@
     </w:p>
     <w:p>
       <w:pPr>
-        <w:spacing w:after="40" w:before="0" w:line="360" w:lineRule="auto"/>
+        <w:spacing w:after="40" w:before="0" w:line="259" w:lineRule="auto"/>
         <w:jc w:val="both"/>
       </w:pPr>
       <w:r>
@@ -760,7 +760,7 @@
     </w:p>
     <w:p>
       <w:pPr>
-        <w:spacing w:after="40" w:before="0" w:line="360" w:lineRule="auto"/>
+        <w:spacing w:after="40" w:before="0" w:line="259" w:lineRule="auto"/>
         <w:jc w:val="both"/>
       </w:pPr>
       <w:r>
@@ -776,7 +776,7 @@
     </w:p>
     <w:p>
       <w:pPr>
-        <w:spacing w:after="40" w:before="0" w:line="360" w:lineRule="auto"/>
+        <w:spacing w:after="40" w:before="0" w:line="259" w:lineRule="auto"/>
         <w:jc w:val="both"/>
       </w:pPr>
       <w:r>
@@ -792,7 +792,7 @@
     </w:p>
     <w:p>
       <w:pPr>
-        <w:spacing w:after="40" w:before="0" w:line="360" w:lineRule="auto"/>
+        <w:spacing w:after="40" w:before="0" w:line="259" w:lineRule="auto"/>
         <w:jc w:val="both"/>
       </w:pPr>
       <w:r>
@@ -808,7 +808,7 @@
     </w:p>
     <w:p>
       <w:pPr>
-        <w:spacing w:after="40" w:before="0" w:line="360" w:lineRule="auto"/>
+        <w:spacing w:after="40" w:before="0" w:line="259" w:lineRule="auto"/>
         <w:jc w:val="both"/>
       </w:pPr>
       <w:r>
@@ -824,7 +824,7 @@
     </w:p>
     <w:p>
       <w:pPr>
-        <w:spacing w:after="40" w:before="0" w:line="360" w:lineRule="auto"/>
+        <w:spacing w:after="40" w:before="0" w:line="259" w:lineRule="auto"/>
         <w:jc w:val="both"/>
       </w:pPr>
       <w:r>
@@ -840,7 +840,7 @@
     </w:p>
     <w:p>
       <w:pPr>
-        <w:spacing w:after="40" w:before="0" w:line="360" w:lineRule="auto"/>
+        <w:spacing w:after="40" w:before="0" w:line="259" w:lineRule="auto"/>
         <w:jc w:val="both"/>
       </w:pPr>
       <w:r>
@@ -856,7 +856,7 @@
     </w:p>
     <w:p>
       <w:pPr>
-        <w:spacing w:after="40" w:before="0" w:line="360" w:lineRule="auto"/>
+        <w:spacing w:after="40" w:before="0" w:line="259" w:lineRule="auto"/>
         <w:jc w:val="both"/>
       </w:pPr>
       <w:r>
@@ -872,7 +872,7 @@
     </w:p>
     <w:p>
       <w:pPr>
-        <w:spacing w:after="160" w:before="0" w:line="360" w:lineRule="auto"/>
+        <w:spacing w:after="80" w:before="0" w:line="259" w:lineRule="auto"/>
         <w:jc w:val="both"/>
       </w:pPr>
       <w:r>
@@ -893,7 +893,7 @@
     </w:p>
     <w:p>
       <w:pPr>
-        <w:spacing w:before="240" w:after="160" w:line="276" w:lineRule="auto"/>
+        <w:spacing w:before="160" w:after="80" w:line="240" w:lineRule="auto"/>
         <w:ind w:firstLine="0"/>
         <w:jc w:val="left"/>
       </w:pPr>
@@ -903,14 +903,14 @@
           <w:b/>
           <w:i w:val="0"/>
           <w:color w:val="000000"/>
-          <w:sz w:val="32"/>
+          <w:sz w:val="28"/>
         </w:rPr>
         <w:t>LIST OF TABLES</w:t>
       </w:r>
     </w:p>
     <w:p>
       <w:pPr>
-        <w:spacing w:after="40" w:before="0" w:line="360" w:lineRule="auto"/>
+        <w:spacing w:after="40" w:before="0" w:line="259" w:lineRule="auto"/>
         <w:jc w:val="both"/>
       </w:pPr>
       <w:r>
@@ -926,7 +926,7 @@
     </w:p>
     <w:p>
       <w:pPr>
-        <w:spacing w:after="40" w:before="0" w:line="360" w:lineRule="auto"/>
+        <w:spacing w:after="40" w:before="0" w:line="259" w:lineRule="auto"/>
         <w:jc w:val="both"/>
       </w:pPr>
       <w:r>
@@ -942,7 +942,7 @@
     </w:p>
     <w:p>
       <w:pPr>
-        <w:spacing w:after="40" w:before="0" w:line="360" w:lineRule="auto"/>
+        <w:spacing w:after="40" w:before="0" w:line="259" w:lineRule="auto"/>
         <w:jc w:val="both"/>
       </w:pPr>
       <w:r>
@@ -958,7 +958,7 @@
     </w:p>
     <w:p>
       <w:pPr>
-        <w:spacing w:after="40" w:before="0" w:line="360" w:lineRule="auto"/>
+        <w:spacing w:after="40" w:before="0" w:line="259" w:lineRule="auto"/>
         <w:jc w:val="both"/>
       </w:pPr>
       <w:r>
@@ -973,13 +973,29 @@
       </w:r>
     </w:p>
     <w:p>
+      <w:pPr>
+        <w:spacing w:after="40" w:before="0" w:line="259" w:lineRule="auto"/>
+        <w:jc w:val="both"/>
+      </w:pPr>
+      <w:r>
+        <w:rPr>
+          <w:rFonts w:ascii="Times New Roman" w:hAnsi="Times New Roman" w:eastAsia="Times New Roman"/>
+          <w:b w:val="0"/>
+          <w:i w:val="0"/>
+          <w:color w:val="000000"/>
+          <w:sz w:val="24"/>
+        </w:rPr>
+        <w:t>5   Literature review</w:t>
+      </w:r>
+    </w:p>
+    <w:p>
       <w:r>
         <w:br w:type="page"/>
       </w:r>
     </w:p>
     <w:p>
       <w:pPr>
-        <w:spacing w:before="240" w:after="160" w:line="276" w:lineRule="auto"/>
+        <w:spacing w:before="160" w:after="80" w:line="240" w:lineRule="auto"/>
         <w:ind w:firstLine="0"/>
         <w:jc w:val="left"/>
       </w:pPr>
@@ -989,7 +1005,7 @@
           <w:b/>
           <w:i w:val="0"/>
           <w:color w:val="000000"/>
-          <w:sz w:val="32"/>
+          <w:sz w:val="28"/>
         </w:rPr>
         <w:t>LIST OF ABBREVIATIONS</w:t>
       </w:r>
@@ -1017,13 +1033,13 @@
         <w:tblLook w:firstColumn="1" w:firstRow="1" w:lastColumn="0" w:lastRow="0" w:noHBand="0" w:noVBand="1" w:val="04A0"/>
       </w:tblPr>
       <w:tblGrid>
-        <w:gridCol w:w="4514"/>
-        <w:gridCol w:w="4514"/>
+        <w:gridCol w:w="4730"/>
+        <w:gridCol w:w="4730"/>
       </w:tblGrid>
       <w:tr>
         <w:tc>
           <w:tcPr>
-            <w:tcW w:type="dxa" w:w="4514"/>
+            <w:tcW w:type="dxa" w:w="4730"/>
             <w:shd w:fill="1F4E79" w:val="clear"/>
           </w:tcPr>
           <w:p>
@@ -1050,7 +1066,7 @@
         </w:tc>
         <w:tc>
           <w:tcPr>
-            <w:tcW w:type="dxa" w:w="4514"/>
+            <w:tcW w:type="dxa" w:w="4730"/>
             <w:shd w:fill="1F4E79" w:val="clear"/>
           </w:tcPr>
           <w:p>
@@ -1079,7 +1095,7 @@
       <w:tr>
         <w:tc>
           <w:tcPr>
-            <w:tcW w:type="dxa" w:w="4514"/>
+            <w:tcW w:type="dxa" w:w="4730"/>
           </w:tcPr>
           <w:p>
             <w:pPr>
@@ -1100,7 +1116,7 @@
         </w:tc>
         <w:tc>
           <w:tcPr>
-            <w:tcW w:type="dxa" w:w="4514"/>
+            <w:tcW w:type="dxa" w:w="4730"/>
           </w:tcPr>
           <w:p>
             <w:pPr>
@@ -1123,7 +1139,7 @@
       <w:tr>
         <w:tc>
           <w:tcPr>
-            <w:tcW w:type="dxa" w:w="4514"/>
+            <w:tcW w:type="dxa" w:w="4730"/>
           </w:tcPr>
           <w:p>
             <w:pPr>
@@ -1144,7 +1160,7 @@
         </w:tc>
         <w:tc>
           <w:tcPr>
-            <w:tcW w:type="dxa" w:w="4514"/>
+            <w:tcW w:type="dxa" w:w="4730"/>
           </w:tcPr>
           <w:p>
             <w:pPr>
@@ -1167,7 +1183,7 @@
       <w:tr>
         <w:tc>
           <w:tcPr>
-            <w:tcW w:type="dxa" w:w="4514"/>
+            <w:tcW w:type="dxa" w:w="4730"/>
           </w:tcPr>
           <w:p>
             <w:pPr>
@@ -1188,7 +1204,7 @@
         </w:tc>
         <w:tc>
           <w:tcPr>
-            <w:tcW w:type="dxa" w:w="4514"/>
+            <w:tcW w:type="dxa" w:w="4730"/>
           </w:tcPr>
           <w:p>
             <w:pPr>
@@ -1211,7 +1227,7 @@
       <w:tr>
         <w:tc>
           <w:tcPr>
-            <w:tcW w:type="dxa" w:w="4514"/>
+            <w:tcW w:type="dxa" w:w="4730"/>
           </w:tcPr>
           <w:p>
             <w:pPr>
@@ -1232,7 +1248,7 @@
         </w:tc>
         <w:tc>
           <w:tcPr>
-            <w:tcW w:type="dxa" w:w="4514"/>
+            <w:tcW w:type="dxa" w:w="4730"/>
           </w:tcPr>
           <w:p>
             <w:pPr>
@@ -1255,7 +1271,7 @@
       <w:tr>
         <w:tc>
           <w:tcPr>
-            <w:tcW w:type="dxa" w:w="4514"/>
+            <w:tcW w:type="dxa" w:w="4730"/>
           </w:tcPr>
           <w:p>
             <w:pPr>
@@ -1276,7 +1292,7 @@
         </w:tc>
         <w:tc>
           <w:tcPr>
-            <w:tcW w:type="dxa" w:w="4514"/>
+            <w:tcW w:type="dxa" w:w="4730"/>
           </w:tcPr>
           <w:p>
             <w:pPr>
@@ -1299,7 +1315,7 @@
       <w:tr>
         <w:tc>
           <w:tcPr>
-            <w:tcW w:type="dxa" w:w="4514"/>
+            <w:tcW w:type="dxa" w:w="4730"/>
           </w:tcPr>
           <w:p>
             <w:pPr>
@@ -1320,7 +1336,7 @@
         </w:tc>
         <w:tc>
           <w:tcPr>
-            <w:tcW w:type="dxa" w:w="4514"/>
+            <w:tcW w:type="dxa" w:w="4730"/>
           </w:tcPr>
           <w:p>
             <w:pPr>
@@ -1343,7 +1359,7 @@
       <w:tr>
         <w:tc>
           <w:tcPr>
-            <w:tcW w:type="dxa" w:w="4514"/>
+            <w:tcW w:type="dxa" w:w="4730"/>
           </w:tcPr>
           <w:p>
             <w:pPr>
@@ -1364,7 +1380,7 @@
         </w:tc>
         <w:tc>
           <w:tcPr>
-            <w:tcW w:type="dxa" w:w="4514"/>
+            <w:tcW w:type="dxa" w:w="4730"/>
           </w:tcPr>
           <w:p>
             <w:pPr>
@@ -1387,7 +1403,7 @@
       <w:tr>
         <w:tc>
           <w:tcPr>
-            <w:tcW w:type="dxa" w:w="4514"/>
+            <w:tcW w:type="dxa" w:w="4730"/>
           </w:tcPr>
           <w:p>
             <w:pPr>
@@ -1408,7 +1424,7 @@
         </w:tc>
         <w:tc>
           <w:tcPr>
-            <w:tcW w:type="dxa" w:w="4514"/>
+            <w:tcW w:type="dxa" w:w="4730"/>
           </w:tcPr>
           <w:p>
             <w:pPr>
@@ -1431,7 +1447,7 @@
       <w:tr>
         <w:tc>
           <w:tcPr>
-            <w:tcW w:type="dxa" w:w="4514"/>
+            <w:tcW w:type="dxa" w:w="4730"/>
           </w:tcPr>
           <w:p>
             <w:pPr>
@@ -1452,7 +1468,7 @@
         </w:tc>
         <w:tc>
           <w:tcPr>
-            <w:tcW w:type="dxa" w:w="4514"/>
+            <w:tcW w:type="dxa" w:w="4730"/>
           </w:tcPr>
           <w:p>
             <w:pPr>
@@ -1481,7 +1497,7 @@
     </w:p>
     <w:p>
       <w:pPr>
-        <w:spacing w:before="240" w:after="160" w:line="276" w:lineRule="auto"/>
+        <w:spacing w:before="160" w:after="80" w:line="240" w:lineRule="auto"/>
         <w:ind w:firstLine="0"/>
         <w:jc w:val="left"/>
       </w:pPr>
@@ -1491,15 +1507,15 @@
           <w:b/>
           <w:i w:val="0"/>
           <w:color w:val="000000"/>
-          <w:sz w:val="32"/>
+          <w:sz w:val="28"/>
         </w:rPr>
         <w:t>ABSTRACT</w:t>
       </w:r>
     </w:p>
     <w:p>
       <w:pPr>
-        <w:spacing w:after="160" w:before="0" w:line="360" w:lineRule="auto"/>
-        <w:ind w:firstLine="432"/>
+        <w:spacing w:after="80" w:before="0" w:line="259" w:lineRule="auto"/>
+        <w:ind w:firstLine="288"/>
         <w:jc w:val="both"/>
       </w:pPr>
       <w:r>
@@ -1515,8 +1531,8 @@
     </w:p>
     <w:p>
       <w:pPr>
-        <w:spacing w:after="160" w:before="0" w:line="360" w:lineRule="auto"/>
-        <w:ind w:firstLine="432"/>
+        <w:spacing w:after="80" w:before="0" w:line="259" w:lineRule="auto"/>
+        <w:ind w:firstLine="288"/>
         <w:jc w:val="both"/>
       </w:pPr>
       <w:r>
@@ -1537,7 +1553,7 @@
     </w:p>
     <w:p>
       <w:pPr>
-        <w:spacing w:before="240" w:after="160" w:line="276" w:lineRule="auto"/>
+        <w:spacing w:before="160" w:after="80" w:line="240" w:lineRule="auto"/>
         <w:ind w:firstLine="0"/>
         <w:jc w:val="left"/>
       </w:pPr>
@@ -1547,15 +1563,15 @@
           <w:b/>
           <w:i w:val="0"/>
           <w:color w:val="000000"/>
-          <w:sz w:val="32"/>
+          <w:sz w:val="28"/>
         </w:rPr>
         <w:t>CHAPTER 1  INTRODUCTION</w:t>
       </w:r>
     </w:p>
     <w:p>
       <w:pPr>
-        <w:spacing w:after="160" w:before="0" w:line="360" w:lineRule="auto"/>
-        <w:ind w:firstLine="432"/>
+        <w:spacing w:after="80" w:before="0" w:line="259" w:lineRule="auto"/>
+        <w:ind w:firstLine="288"/>
         <w:jc w:val="both"/>
       </w:pPr>
       <w:r>
@@ -1571,7 +1587,7 @@
     </w:p>
     <w:p>
       <w:pPr>
-        <w:spacing w:before="240" w:after="160" w:line="276" w:lineRule="auto"/>
+        <w:spacing w:before="160" w:after="80" w:line="240" w:lineRule="auto"/>
         <w:ind w:firstLine="0"/>
         <w:jc w:val="left"/>
       </w:pPr>
@@ -1581,15 +1597,15 @@
           <w:b/>
           <w:i w:val="0"/>
           <w:color w:val="000000"/>
-          <w:sz w:val="28"/>
+          <w:sz w:val="24"/>
         </w:rPr>
         <w:t>1.1  Background</w:t>
       </w:r>
     </w:p>
     <w:p>
       <w:pPr>
-        <w:spacing w:after="160" w:before="0" w:line="360" w:lineRule="auto"/>
-        <w:ind w:firstLine="432"/>
+        <w:spacing w:after="80" w:before="0" w:line="259" w:lineRule="auto"/>
+        <w:ind w:firstLine="288"/>
         <w:jc w:val="both"/>
       </w:pPr>
       <w:r>
@@ -1605,8 +1621,8 @@
     </w:p>
     <w:p>
       <w:pPr>
-        <w:spacing w:after="160" w:before="0" w:line="360" w:lineRule="auto"/>
-        <w:ind w:firstLine="432"/>
+        <w:spacing w:after="80" w:before="0" w:line="259" w:lineRule="auto"/>
+        <w:ind w:firstLine="288"/>
         <w:jc w:val="both"/>
       </w:pPr>
       <w:r>
@@ -1622,7 +1638,7 @@
     </w:p>
     <w:p>
       <w:pPr>
-        <w:spacing w:before="240" w:after="160" w:line="276" w:lineRule="auto"/>
+        <w:spacing w:before="160" w:after="80" w:line="240" w:lineRule="auto"/>
         <w:ind w:firstLine="0"/>
         <w:jc w:val="left"/>
       </w:pPr>
@@ -1632,15 +1648,15 @@
           <w:b/>
           <w:i w:val="0"/>
           <w:color w:val="000000"/>
-          <w:sz w:val="28"/>
+          <w:sz w:val="24"/>
         </w:rPr>
         <w:t>1.2  Motivation</w:t>
       </w:r>
     </w:p>
     <w:p>
       <w:pPr>
-        <w:spacing w:after="160" w:before="0" w:line="360" w:lineRule="auto"/>
-        <w:ind w:firstLine="432"/>
+        <w:spacing w:after="80" w:before="0" w:line="259" w:lineRule="auto"/>
+        <w:ind w:firstLine="288"/>
         <w:jc w:val="both"/>
       </w:pPr>
       <w:r>
@@ -1656,7 +1672,7 @@
     </w:p>
     <w:p>
       <w:pPr>
-        <w:spacing w:before="240" w:after="160" w:line="276" w:lineRule="auto"/>
+        <w:spacing w:before="160" w:after="80" w:line="240" w:lineRule="auto"/>
         <w:ind w:firstLine="0"/>
         <w:jc w:val="left"/>
       </w:pPr>
@@ -1666,15 +1682,15 @@
           <w:b/>
           <w:i w:val="0"/>
           <w:color w:val="000000"/>
-          <w:sz w:val="28"/>
+          <w:sz w:val="24"/>
         </w:rPr>
         <w:t>1.3  Statement of the Problem and Objectives</w:t>
       </w:r>
     </w:p>
     <w:p>
       <w:pPr>
-        <w:spacing w:after="160" w:before="0" w:line="360" w:lineRule="auto"/>
-        <w:ind w:firstLine="432"/>
+        <w:spacing w:after="80" w:before="0" w:line="259" w:lineRule="auto"/>
+        <w:ind w:firstLine="288"/>
         <w:jc w:val="both"/>
       </w:pPr>
       <w:r>
@@ -1690,7 +1706,7 @@
     </w:p>
     <w:p>
       <w:pPr>
-        <w:spacing w:after="160" w:before="0" w:line="360" w:lineRule="auto"/>
+        <w:spacing w:after="80" w:before="0" w:line="259" w:lineRule="auto"/>
         <w:jc w:val="both"/>
       </w:pPr>
       <w:r>
@@ -1706,7 +1722,7 @@
     </w:p>
     <w:p>
       <w:pPr>
-        <w:spacing w:after="80" w:before="0" w:line="360" w:lineRule="auto"/>
+        <w:spacing w:after="80" w:before="0" w:line="259" w:lineRule="auto"/>
         <w:jc w:val="both"/>
       </w:pPr>
       <w:r>
@@ -1722,7 +1738,7 @@
     </w:p>
     <w:p>
       <w:pPr>
-        <w:spacing w:after="80" w:before="0" w:line="360" w:lineRule="auto"/>
+        <w:spacing w:after="80" w:before="0" w:line="259" w:lineRule="auto"/>
         <w:jc w:val="both"/>
       </w:pPr>
       <w:r>
@@ -1738,7 +1754,7 @@
     </w:p>
     <w:p>
       <w:pPr>
-        <w:spacing w:after="80" w:before="0" w:line="360" w:lineRule="auto"/>
+        <w:spacing w:after="80" w:before="0" w:line="259" w:lineRule="auto"/>
         <w:jc w:val="both"/>
       </w:pPr>
       <w:r>
@@ -1754,7 +1770,7 @@
     </w:p>
     <w:p>
       <w:pPr>
-        <w:spacing w:after="80" w:before="0" w:line="360" w:lineRule="auto"/>
+        <w:spacing w:after="80" w:before="0" w:line="259" w:lineRule="auto"/>
         <w:jc w:val="both"/>
       </w:pPr>
       <w:r>
@@ -1775,24 +1791,7 @@
     </w:p>
     <w:p>
       <w:pPr>
-        <w:spacing w:before="240" w:after="160" w:line="276" w:lineRule="auto"/>
-        <w:ind w:firstLine="0"/>
-        <w:jc w:val="left"/>
-      </w:pPr>
-      <w:r>
-        <w:rPr>
-          <w:rFonts w:ascii="Times New Roman" w:hAnsi="Times New Roman" w:eastAsia="Times New Roman"/>
-          <w:b/>
-          <w:i w:val="0"/>
-          <w:color w:val="000000"/>
-          <w:sz w:val="32"/>
-        </w:rPr>
-        <w:t>CHAPTER 2  LITERATURE REVIEW</w:t>
-      </w:r>
-    </w:p>
-    <w:p>
-      <w:pPr>
-        <w:spacing w:before="240" w:after="160" w:line="276" w:lineRule="auto"/>
+        <w:spacing w:before="160" w:after="80" w:line="240" w:lineRule="auto"/>
         <w:ind w:firstLine="0"/>
         <w:jc w:val="left"/>
       </w:pPr>
@@ -1804,13 +1803,29 @@
           <w:color w:val="000000"/>
           <w:sz w:val="28"/>
         </w:rPr>
+        <w:t>CHAPTER 2  LITERATURE REVIEW</w:t>
+      </w:r>
+    </w:p>
+    <w:p>
+      <w:pPr>
+        <w:spacing w:before="160" w:after="80" w:line="240" w:lineRule="auto"/>
+        <w:ind w:firstLine="0"/>
+        <w:jc w:val="left"/>
+      </w:pPr>
+      <w:r>
+        <w:rPr>
+          <w:rFonts w:ascii="Times New Roman" w:hAnsi="Times New Roman" w:eastAsia="Times New Roman"/>
+          <w:b/>
+          <w:i w:val="0"/>
+          <w:color w:val="000000"/>
+          <w:sz w:val="24"/>
+        </w:rPr>
         <w:t>2.1  Related Work</w:t>
       </w:r>
     </w:p>
     <w:p>
       <w:pPr>
-        <w:spacing w:after="160" w:before="0" w:line="360" w:lineRule="auto"/>
-        <w:ind w:firstLine="432"/>
+        <w:spacing w:after="80" w:before="0" w:line="259" w:lineRule="auto"/>
         <w:jc w:val="both"/>
       </w:pPr>
       <w:r>
@@ -1821,13 +1836,600 @@
           <w:color w:val="000000"/>
           <w:sz w:val="24"/>
         </w:rPr>
-        <w:t>Harper and Konstan describe the MovieLens releases, how the ratings were collected, and why the sets are used as a shared benchmark rather than as a private viewing log [1]. That distinction matters here. A rating is an explicit score given by a user. It is evidence of interest, not evidence that the user watched the title on a particular streaming plan.</w:t>
+        <w:t>Table 5 places each cited work against the one question this project asks. The papers supply the dataset and the storage model. None of them computes a genre-level content gap from MovieLens ratings and India subscription providers.</w:t>
       </w:r>
     </w:p>
     <w:p>
       <w:pPr>
-        <w:spacing w:after="160" w:before="0" w:line="360" w:lineRule="auto"/>
-        <w:ind w:firstLine="432"/>
+        <w:spacing w:before="160" w:after="80"/>
+        <w:jc w:val="center"/>
+      </w:pPr>
+      <w:r>
+        <w:rPr>
+          <w:rFonts w:ascii="Times New Roman" w:hAnsi="Times New Roman" w:eastAsia="Times New Roman"/>
+          <w:b/>
+          <w:i w:val="0"/>
+          <w:color w:val="000000"/>
+          <w:sz w:val="22"/>
+        </w:rPr>
+        <w:t>Table 5. Literature review</w:t>
+      </w:r>
+    </w:p>
+    <w:tbl>
+      <w:tblPr>
+        <w:tblStyle w:val="TableGrid"/>
+        <w:tblW w:type="auto" w:w="0"/>
+        <w:tblLook w:firstColumn="1" w:firstRow="1" w:lastColumn="0" w:lastRow="0" w:noHBand="0" w:noVBand="1" w:val="04A0"/>
+      </w:tblPr>
+      <w:tblGrid>
+        <w:gridCol w:w="2365"/>
+        <w:gridCol w:w="2365"/>
+        <w:gridCol w:w="2365"/>
+        <w:gridCol w:w="2365"/>
+      </w:tblGrid>
+      <w:tr>
+        <w:tc>
+          <w:tcPr>
+            <w:tcW w:type="dxa" w:w="2365"/>
+            <w:shd w:fill="1F4E79" w:val="clear"/>
+          </w:tcPr>
+          <w:p>
+            <w:pPr>
+              <w:jc w:val="center"/>
+            </w:pPr>
+            <w:r>
+              <w:rPr>
+                <w:b/>
+                <w:color w:val="FFFFFF"/>
+              </w:rPr>
+            </w:r>
+            <w:r>
+              <w:rPr>
+                <w:rFonts w:ascii="Times New Roman" w:hAnsi="Times New Roman" w:eastAsia="Times New Roman"/>
+                <w:b/>
+                <w:i w:val="0"/>
+                <w:color w:val="FFFFFF"/>
+                <w:sz w:val="20"/>
+              </w:rPr>
+              <w:t>Author, year</w:t>
+            </w:r>
+          </w:p>
+        </w:tc>
+        <w:tc>
+          <w:tcPr>
+            <w:tcW w:type="dxa" w:w="2365"/>
+            <w:shd w:fill="1F4E79" w:val="clear"/>
+          </w:tcPr>
+          <w:p>
+            <w:pPr>
+              <w:jc w:val="center"/>
+            </w:pPr>
+            <w:r>
+              <w:rPr>
+                <w:b/>
+                <w:color w:val="FFFFFF"/>
+              </w:rPr>
+            </w:r>
+            <w:r>
+              <w:rPr>
+                <w:rFonts w:ascii="Times New Roman" w:hAnsi="Times New Roman" w:eastAsia="Times New Roman"/>
+                <w:b/>
+                <w:i w:val="0"/>
+                <w:color w:val="FFFFFF"/>
+                <w:sz w:val="20"/>
+              </w:rPr>
+              <w:t>What the work did</w:t>
+            </w:r>
+          </w:p>
+        </w:tc>
+        <w:tc>
+          <w:tcPr>
+            <w:tcW w:type="dxa" w:w="2365"/>
+            <w:shd w:fill="1F4E79" w:val="clear"/>
+          </w:tcPr>
+          <w:p>
+            <w:pPr>
+              <w:jc w:val="center"/>
+            </w:pPr>
+            <w:r>
+              <w:rPr>
+                <w:b/>
+                <w:color w:val="FFFFFF"/>
+              </w:rPr>
+            </w:r>
+            <w:r>
+              <w:rPr>
+                <w:rFonts w:ascii="Times New Roman" w:hAnsi="Times New Roman" w:eastAsia="Times New Roman"/>
+                <w:b/>
+                <w:i w:val="0"/>
+                <w:color w:val="FFFFFF"/>
+                <w:sz w:val="20"/>
+              </w:rPr>
+              <w:t>What this project takes from it</w:t>
+            </w:r>
+          </w:p>
+        </w:tc>
+        <w:tc>
+          <w:tcPr>
+            <w:tcW w:type="dxa" w:w="2365"/>
+            <w:shd w:fill="1F4E79" w:val="clear"/>
+          </w:tcPr>
+          <w:p>
+            <w:pPr>
+              <w:jc w:val="center"/>
+            </w:pPr>
+            <w:r>
+              <w:rPr>
+                <w:b/>
+                <w:color w:val="FFFFFF"/>
+              </w:rPr>
+            </w:r>
+            <w:r>
+              <w:rPr>
+                <w:rFonts w:ascii="Times New Roman" w:hAnsi="Times New Roman" w:eastAsia="Times New Roman"/>
+                <w:b/>
+                <w:i w:val="0"/>
+                <w:color w:val="FFFFFF"/>
+                <w:sz w:val="20"/>
+              </w:rPr>
+              <w:t>What it does not answer</w:t>
+            </w:r>
+          </w:p>
+        </w:tc>
+      </w:tr>
+      <w:tr>
+        <w:tc>
+          <w:tcPr>
+            <w:tcW w:type="dxa" w:w="2365"/>
+          </w:tcPr>
+          <w:p>
+            <w:pPr>
+              <w:jc w:val="left"/>
+            </w:pPr>
+            <w:r/>
+            <w:r>
+              <w:rPr>
+                <w:rFonts w:ascii="Times New Roman" w:hAnsi="Times New Roman" w:eastAsia="Times New Roman"/>
+                <w:b w:val="0"/>
+                <w:i w:val="0"/>
+                <w:color w:val="000000"/>
+                <w:sz w:val="20"/>
+              </w:rPr>
+              <w:t>Harper and Konstan, 2015 [1]</w:t>
+            </w:r>
+          </w:p>
+        </w:tc>
+        <w:tc>
+          <w:tcPr>
+            <w:tcW w:type="dxa" w:w="2365"/>
+          </w:tcPr>
+          <w:p>
+            <w:pPr>
+              <w:jc w:val="center"/>
+            </w:pPr>
+            <w:r/>
+            <w:r>
+              <w:rPr>
+                <w:rFonts w:ascii="Times New Roman" w:hAnsi="Times New Roman" w:eastAsia="Times New Roman"/>
+                <w:b w:val="0"/>
+                <w:i w:val="0"/>
+                <w:color w:val="000000"/>
+                <w:sz w:val="20"/>
+              </w:rPr>
+              <w:t>Documented how MovieLens ratings were collected and why the releases are a shared benchmark.</w:t>
+            </w:r>
+          </w:p>
+        </w:tc>
+        <w:tc>
+          <w:tcPr>
+            <w:tcW w:type="dxa" w:w="2365"/>
+          </w:tcPr>
+          <w:p>
+            <w:pPr>
+              <w:jc w:val="center"/>
+            </w:pPr>
+            <w:r/>
+            <w:r>
+              <w:rPr>
+                <w:rFonts w:ascii="Times New Roman" w:hAnsi="Times New Roman" w:eastAsia="Times New Roman"/>
+                <w:b w:val="0"/>
+                <w:i w:val="0"/>
+                <w:color w:val="000000"/>
+                <w:sz w:val="20"/>
+              </w:rPr>
+              <w:t>Use of the 32M ratings as an interest signal, with the limit that a rating is not a view.</w:t>
+            </w:r>
+          </w:p>
+        </w:tc>
+        <w:tc>
+          <w:tcPr>
+            <w:tcW w:type="dxa" w:w="2365"/>
+          </w:tcPr>
+          <w:p>
+            <w:pPr>
+              <w:jc w:val="center"/>
+            </w:pPr>
+            <w:r/>
+            <w:r>
+              <w:rPr>
+                <w:rFonts w:ascii="Times New Roman" w:hAnsi="Times New Roman" w:eastAsia="Times New Roman"/>
+                <w:b w:val="0"/>
+                <w:i w:val="0"/>
+                <w:color w:val="000000"/>
+                <w:sz w:val="20"/>
+              </w:rPr>
+              <w:t>No genre catalogue gap and no streaming-provider coverage.</w:t>
+            </w:r>
+          </w:p>
+        </w:tc>
+      </w:tr>
+      <w:tr>
+        <w:tc>
+          <w:tcPr>
+            <w:tcW w:type="dxa" w:w="2365"/>
+          </w:tcPr>
+          <w:p>
+            <w:pPr>
+              <w:jc w:val="left"/>
+            </w:pPr>
+            <w:r/>
+            <w:r>
+              <w:rPr>
+                <w:rFonts w:ascii="Times New Roman" w:hAnsi="Times New Roman" w:eastAsia="Times New Roman"/>
+                <w:b w:val="0"/>
+                <w:i w:val="0"/>
+                <w:color w:val="000000"/>
+                <w:sz w:val="20"/>
+              </w:rPr>
+              <w:t>Dean and Ghemawat, 2004 [2]</w:t>
+            </w:r>
+          </w:p>
+        </w:tc>
+        <w:tc>
+          <w:tcPr>
+            <w:tcW w:type="dxa" w:w="2365"/>
+          </w:tcPr>
+          <w:p>
+            <w:pPr>
+              <w:jc w:val="center"/>
+            </w:pPr>
+            <w:r/>
+            <w:r>
+              <w:rPr>
+                <w:rFonts w:ascii="Times New Roman" w:hAnsi="Times New Roman" w:eastAsia="Times New Roman"/>
+                <w:b w:val="0"/>
+                <w:i w:val="0"/>
+                <w:color w:val="000000"/>
+                <w:sz w:val="20"/>
+              </w:rPr>
+              <w:t>Defined MapReduce for applying one computation across a large set of records.</w:t>
+            </w:r>
+          </w:p>
+        </w:tc>
+        <w:tc>
+          <w:tcPr>
+            <w:tcW w:type="dxa" w:w="2365"/>
+          </w:tcPr>
+          <w:p>
+            <w:pPr>
+              <w:jc w:val="center"/>
+            </w:pPr>
+            <w:r/>
+            <w:r>
+              <w:rPr>
+                <w:rFonts w:ascii="Times New Roman" w:hAnsi="Times New Roman" w:eastAsia="Times New Roman"/>
+                <w:b w:val="0"/>
+                <w:i w:val="0"/>
+                <w:color w:val="000000"/>
+                <w:sz w:val="20"/>
+              </w:rPr>
+              <w:t>The decision to aggregate ratings by genre instead of scanning the CSV in a spreadsheet.</w:t>
+            </w:r>
+          </w:p>
+        </w:tc>
+        <w:tc>
+          <w:tcPr>
+            <w:tcW w:type="dxa" w:w="2365"/>
+          </w:tcPr>
+          <w:p>
+            <w:pPr>
+              <w:jc w:val="center"/>
+            </w:pPr>
+            <w:r/>
+            <w:r>
+              <w:rPr>
+                <w:rFonts w:ascii="Times New Roman" w:hAnsi="Times New Roman" w:eastAsia="Times New Roman"/>
+                <w:b w:val="0"/>
+                <w:i w:val="0"/>
+                <w:color w:val="000000"/>
+                <w:sz w:val="20"/>
+              </w:rPr>
+              <w:t>No file-block storage and no genre result.</w:t>
+            </w:r>
+          </w:p>
+        </w:tc>
+      </w:tr>
+      <w:tr>
+        <w:tc>
+          <w:tcPr>
+            <w:tcW w:type="dxa" w:w="2365"/>
+          </w:tcPr>
+          <w:p>
+            <w:pPr>
+              <w:jc w:val="left"/>
+            </w:pPr>
+            <w:r/>
+            <w:r>
+              <w:rPr>
+                <w:rFonts w:ascii="Times New Roman" w:hAnsi="Times New Roman" w:eastAsia="Times New Roman"/>
+                <w:b w:val="0"/>
+                <w:i w:val="0"/>
+                <w:color w:val="000000"/>
+                <w:sz w:val="20"/>
+              </w:rPr>
+              <w:t>Shvachko et al., 2010 [3]</w:t>
+            </w:r>
+          </w:p>
+        </w:tc>
+        <w:tc>
+          <w:tcPr>
+            <w:tcW w:type="dxa" w:w="2365"/>
+          </w:tcPr>
+          <w:p>
+            <w:pPr>
+              <w:jc w:val="center"/>
+            </w:pPr>
+            <w:r/>
+            <w:r>
+              <w:rPr>
+                <w:rFonts w:ascii="Times New Roman" w:hAnsi="Times New Roman" w:eastAsia="Times New Roman"/>
+                <w:b w:val="0"/>
+                <w:i w:val="0"/>
+                <w:color w:val="000000"/>
+                <w:sz w:val="20"/>
+              </w:rPr>
+              <w:t>Specified HDFS: the NameNode stores the index and DataNodes store the blocks.</w:t>
+            </w:r>
+          </w:p>
+        </w:tc>
+        <w:tc>
+          <w:tcPr>
+            <w:tcW w:type="dxa" w:w="2365"/>
+          </w:tcPr>
+          <w:p>
+            <w:pPr>
+              <w:jc w:val="center"/>
+            </w:pPr>
+            <w:r/>
+            <w:r>
+              <w:rPr>
+                <w:rFonts w:ascii="Times New Roman" w:hAnsi="Times New Roman" w:eastAsia="Times New Roman"/>
+                <w:b w:val="0"/>
+                <w:i w:val="0"/>
+                <w:color w:val="000000"/>
+                <w:sz w:val="20"/>
+              </w:rPr>
+              <w:t>The single-node layout, replication 1, and the fsck check used in Chapter 4.</w:t>
+            </w:r>
+          </w:p>
+        </w:tc>
+        <w:tc>
+          <w:tcPr>
+            <w:tcW w:type="dxa" w:w="2365"/>
+          </w:tcPr>
+          <w:p>
+            <w:pPr>
+              <w:jc w:val="center"/>
+            </w:pPr>
+            <w:r/>
+            <w:r>
+              <w:rPr>
+                <w:rFonts w:ascii="Times New Roman" w:hAnsi="Times New Roman" w:eastAsia="Times New Roman"/>
+                <w:b w:val="0"/>
+                <w:i w:val="0"/>
+                <w:color w:val="000000"/>
+                <w:sz w:val="20"/>
+              </w:rPr>
+              <w:t>The paper's setting is a multi-node cluster. This laptop has one DataNode.</w:t>
+            </w:r>
+          </w:p>
+        </w:tc>
+      </w:tr>
+      <w:tr>
+        <w:tc>
+          <w:tcPr>
+            <w:tcW w:type="dxa" w:w="2365"/>
+          </w:tcPr>
+          <w:p>
+            <w:pPr>
+              <w:jc w:val="left"/>
+            </w:pPr>
+            <w:r/>
+            <w:r>
+              <w:rPr>
+                <w:rFonts w:ascii="Times New Roman" w:hAnsi="Times New Roman" w:eastAsia="Times New Roman"/>
+                <w:b w:val="0"/>
+                <w:i w:val="0"/>
+                <w:color w:val="000000"/>
+                <w:sz w:val="20"/>
+              </w:rPr>
+              <w:t>Zaharia et al., 2012 [4]</w:t>
+            </w:r>
+          </w:p>
+        </w:tc>
+        <w:tc>
+          <w:tcPr>
+            <w:tcW w:type="dxa" w:w="2365"/>
+          </w:tcPr>
+          <w:p>
+            <w:pPr>
+              <w:jc w:val="center"/>
+            </w:pPr>
+            <w:r/>
+            <w:r>
+              <w:rPr>
+                <w:rFonts w:ascii="Times New Roman" w:hAnsi="Times New Roman" w:eastAsia="Times New Roman"/>
+                <w:b w:val="0"/>
+                <w:i w:val="0"/>
+                <w:color w:val="000000"/>
+                <w:sz w:val="20"/>
+              </w:rPr>
+              <w:t>Introduced Spark so a computation can reuse data in memory instead of rewriting every step to disk.</w:t>
+            </w:r>
+          </w:p>
+        </w:tc>
+        <w:tc>
+          <w:tcPr>
+            <w:tcW w:type="dxa" w:w="2365"/>
+          </w:tcPr>
+          <w:p>
+            <w:pPr>
+              <w:jc w:val="center"/>
+            </w:pPr>
+            <w:r/>
+            <w:r>
+              <w:rPr>
+                <w:rFonts w:ascii="Times New Roman" w:hAnsi="Times New Roman" w:eastAsia="Times New Roman"/>
+                <w:b w:val="0"/>
+                <w:i w:val="0"/>
+                <w:color w:val="000000"/>
+                <w:sz w:val="20"/>
+              </w:rPr>
+              <w:t>The PySpark join and genre aggregation that reads hdfs://localhost:9000.</w:t>
+            </w:r>
+          </w:p>
+        </w:tc>
+        <w:tc>
+          <w:tcPr>
+            <w:tcW w:type="dxa" w:w="2365"/>
+          </w:tcPr>
+          <w:p>
+            <w:pPr>
+              <w:jc w:val="center"/>
+            </w:pPr>
+            <w:r/>
+            <w:r>
+              <w:rPr>
+                <w:rFonts w:ascii="Times New Roman" w:hAnsi="Times New Roman" w:eastAsia="Times New Roman"/>
+                <w:b w:val="0"/>
+                <w:i w:val="0"/>
+                <w:color w:val="000000"/>
+                <w:sz w:val="20"/>
+              </w:rPr>
+              <w:t>No dashboard and no comparison of ratings per movie.</w:t>
+            </w:r>
+          </w:p>
+        </w:tc>
+      </w:tr>
+      <w:tr>
+        <w:tc>
+          <w:tcPr>
+            <w:tcW w:type="dxa" w:w="2365"/>
+          </w:tcPr>
+          <w:p>
+            <w:pPr>
+              <w:jc w:val="left"/>
+            </w:pPr>
+            <w:r/>
+            <w:r>
+              <w:rPr>
+                <w:rFonts w:ascii="Times New Roman" w:hAnsi="Times New Roman" w:eastAsia="Times New Roman"/>
+                <w:b w:val="0"/>
+                <w:i w:val="0"/>
+                <w:color w:val="000000"/>
+                <w:sz w:val="20"/>
+              </w:rPr>
+              <w:t>Gomez-Uribe and Hunt, 2016 [5]</w:t>
+            </w:r>
+          </w:p>
+        </w:tc>
+        <w:tc>
+          <w:tcPr>
+            <w:tcW w:type="dxa" w:w="2365"/>
+          </w:tcPr>
+          <w:p>
+            <w:pPr>
+              <w:jc w:val="center"/>
+            </w:pPr>
+            <w:r/>
+            <w:r>
+              <w:rPr>
+                <w:rFonts w:ascii="Times New Roman" w:hAnsi="Times New Roman" w:eastAsia="Times New Roman"/>
+                <w:b w:val="0"/>
+                <w:i w:val="0"/>
+                <w:color w:val="000000"/>
+                <w:sz w:val="20"/>
+              </w:rPr>
+              <w:t>Described the Netflix recommender and why catalogue ranking has business value.</w:t>
+            </w:r>
+          </w:p>
+        </w:tc>
+        <w:tc>
+          <w:tcPr>
+            <w:tcW w:type="dxa" w:w="2365"/>
+          </w:tcPr>
+          <w:p>
+            <w:pPr>
+              <w:jc w:val="center"/>
+            </w:pPr>
+            <w:r/>
+            <w:r>
+              <w:rPr>
+                <w:rFonts w:ascii="Times New Roman" w:hAnsi="Times New Roman" w:eastAsia="Times New Roman"/>
+                <w:b w:val="0"/>
+                <w:i w:val="0"/>
+                <w:color w:val="000000"/>
+                <w:sz w:val="20"/>
+              </w:rPr>
+              <w:t>The idea that a catalogue decision needs a demand signal, not only a title list.</w:t>
+            </w:r>
+          </w:p>
+        </w:tc>
+        <w:tc>
+          <w:tcPr>
+            <w:tcW w:type="dxa" w:w="2365"/>
+          </w:tcPr>
+          <w:p>
+            <w:pPr>
+              <w:jc w:val="center"/>
+            </w:pPr>
+            <w:r/>
+            <w:r>
+              <w:rPr>
+                <w:rFonts w:ascii="Times New Roman" w:hAnsi="Times New Roman" w:eastAsia="Times New Roman"/>
+                <w:b w:val="0"/>
+                <w:i w:val="0"/>
+                <w:color w:val="000000"/>
+                <w:sz w:val="20"/>
+              </w:rPr>
+              <w:t>Uses private Netflix viewing data. It is not a method for MovieLens or for HDFS.</w:t>
+            </w:r>
+          </w:p>
+        </w:tc>
+      </w:tr>
+    </w:tbl>
+    <w:p/>
+    <w:p>
+      <w:pPr>
+        <w:spacing w:before="160" w:after="80" w:line="240" w:lineRule="auto"/>
+        <w:ind w:firstLine="0"/>
+        <w:jc w:val="left"/>
+      </w:pPr>
+      <w:r>
+        <w:rPr>
+          <w:rFonts w:ascii="Times New Roman" w:hAnsi="Times New Roman" w:eastAsia="Times New Roman"/>
+          <w:b/>
+          <w:i w:val="0"/>
+          <w:color w:val="000000"/>
+          <w:sz w:val="24"/>
+        </w:rPr>
+        <w:t>2.2  Summary and Research Gap</w:t>
+      </w:r>
+    </w:p>
+    <w:p>
+      <w:pPr>
+        <w:spacing w:after="80" w:before="0" w:line="259" w:lineRule="auto"/>
+        <w:ind w:firstLine="288"/>
         <w:jc w:val="both"/>
       </w:pPr>
       <w:r>
@@ -1838,29 +2440,17 @@
           <w:color w:val="000000"/>
           <w:sz w:val="24"/>
         </w:rPr>
-        <w:t>Dean and Ghemawat introduced MapReduce as a way to run a simple computation across records that do not fit a single conventional pass in a convenient way [2]. HDFS, described by Shvachko, Kuang, Radia, and Chansler, separates the file index (the NameNode) from the stored blocks (the DataNodes) [3]. StreamScope uses that split directly. The NameNode records the path /streamscope/raw/movielens/ratings.csv and the seven block ids. The DataNode holds the bytes.</w:t>
+        <w:t>Three gaps follow from Table 5. Genre labels overlap, so genre totals are not a split of the 32,000,204 ratings. A high rating count can just mean a large catalogue, so ratings per movie has to be reported beside it. India subscription availability is not in MovieLens and has to be joined through the TMDB id. This report completes the first two measurements. The third is implemented as a MongoDB query, and the provider collection was not confirmed complete.</w:t>
+      </w:r>
+    </w:p>
+    <w:p>
+      <w:r>
+        <w:br w:type="page"/>
       </w:r>
     </w:p>
     <w:p>
       <w:pPr>
-        <w:spacing w:after="160" w:before="0" w:line="360" w:lineRule="auto"/>
-        <w:ind w:firstLine="432"/>
-        <w:jc w:val="both"/>
-      </w:pPr>
-      <w:r>
-        <w:rPr>
-          <w:rFonts w:ascii="Times New Roman" w:hAnsi="Times New Roman" w:eastAsia="Times New Roman"/>
-          <w:b w:val="0"/>
-          <w:i w:val="0"/>
-          <w:color w:val="000000"/>
-          <w:sz w:val="24"/>
-        </w:rPr>
-        <w:t>Zaharia and others designed Spark so that a later action can reuse data already read, instead of writing every intermediate result back to disk as a MapReduce job often does [4]. The genre job is one Spark action: join ratings to movies, split the genre string, and aggregate. The result is small enough to store in MongoDB and query from a web page. MongoDB is used because the TMDB response is a nested JSON document, which is the unstructured record the Docker part of the rubric asks to store and query.</w:t>
-      </w:r>
-    </w:p>
-    <w:p>
-      <w:pPr>
-        <w:spacing w:before="240" w:after="160" w:line="276" w:lineRule="auto"/>
+        <w:spacing w:before="160" w:after="80" w:line="240" w:lineRule="auto"/>
         <w:ind w:firstLine="0"/>
         <w:jc w:val="left"/>
       </w:pPr>
@@ -1872,34 +2462,12 @@
           <w:color w:val="000000"/>
           <w:sz w:val="28"/>
         </w:rPr>
-        <w:t>2.2  Summary and Research Gap</w:t>
+        <w:t>CHAPTER 3  METHODOLOGY</w:t>
       </w:r>
     </w:p>
     <w:p>
       <w:pPr>
-        <w:spacing w:after="160" w:before="0" w:line="360" w:lineRule="auto"/>
-        <w:ind w:firstLine="432"/>
-        <w:jc w:val="both"/>
-      </w:pPr>
-      <w:r>
-        <w:rPr>
-          <w:rFonts w:ascii="Times New Roman" w:hAnsi="Times New Roman" w:eastAsia="Times New Roman"/>
-          <w:b w:val="0"/>
-          <w:i w:val="0"/>
-          <w:color w:val="000000"/>
-          <w:sz w:val="24"/>
-        </w:rPr>
-        <w:t>The cited work explains the dataset and the storage and processing tools. It does not answer the catalogue question for this laptop. Three gaps are specific to StreamScope. First, genre labels overlap, so a total of ratings by genre is not a partition of the 32,000,204 rows. Second, a high rating count can be an effect of a large catalogue, so ratings per movie has to be reported beside the raw count. Third, availability on an India subscription plan is not in MovieLens at all. It has to be joined later through the TMDB identifier. This report completes the first two measurements. The third is implemented as a query, and the document collection was not confirmed complete at 2,000 titles.</w:t>
-      </w:r>
-    </w:p>
-    <w:p>
-      <w:r>
-        <w:br w:type="page"/>
-      </w:r>
-    </w:p>
-    <w:p>
-      <w:pPr>
-        <w:spacing w:before="240" w:after="160" w:line="276" w:lineRule="auto"/>
+        <w:spacing w:before="160" w:after="80" w:line="240" w:lineRule="auto"/>
         <w:ind w:firstLine="0"/>
         <w:jc w:val="left"/>
       </w:pPr>
@@ -1909,32 +2477,15 @@
           <w:b/>
           <w:i w:val="0"/>
           <w:color w:val="000000"/>
-          <w:sz w:val="32"/>
-        </w:rPr>
-        <w:t>CHAPTER 3  METHODOLOGY</w:t>
-      </w:r>
-    </w:p>
-    <w:p>
-      <w:pPr>
-        <w:spacing w:before="240" w:after="160" w:line="276" w:lineRule="auto"/>
-        <w:ind w:firstLine="0"/>
-        <w:jc w:val="left"/>
-      </w:pPr>
-      <w:r>
-        <w:rPr>
-          <w:rFonts w:ascii="Times New Roman" w:hAnsi="Times New Roman" w:eastAsia="Times New Roman"/>
-          <w:b/>
-          <w:i w:val="0"/>
-          <w:color w:val="000000"/>
-          <w:sz w:val="28"/>
+          <w:sz w:val="24"/>
         </w:rPr>
         <w:t>3.1  Processing Model and Tools</w:t>
       </w:r>
     </w:p>
     <w:p>
       <w:pPr>
-        <w:spacing w:after="160" w:before="0" w:line="360" w:lineRule="auto"/>
-        <w:ind w:firstLine="432"/>
+        <w:spacing w:after="80" w:before="0" w:line="259" w:lineRule="auto"/>
+        <w:ind w:firstLine="288"/>
         <w:jc w:val="both"/>
       </w:pPr>
       <w:r>
@@ -1956,7 +2507,7 @@
       <w:r>
         <w:drawing>
           <wp:inline xmlns:a="http://schemas.openxmlformats.org/drawingml/2006/main" xmlns:pic="http://schemas.openxmlformats.org/drawingml/2006/picture">
-            <wp:extent cx="5760720" cy="4032504"/>
+            <wp:extent cx="4963885" cy="3474720"/>
             <wp:docPr id="1" name="Picture 1"/>
             <wp:cNvGraphicFramePr>
               <a:graphicFrameLocks noChangeAspect="1"/>
@@ -1977,7 +2528,7 @@
                   <pic:spPr>
                     <a:xfrm>
                       <a:off x="0" y="0"/>
-                      <a:ext cx="5760720" cy="4032504"/>
+                      <a:ext cx="4963885" cy="3474720"/>
                     </a:xfrm>
                     <a:prstGeom prst="rect"/>
                   </pic:spPr>
@@ -2028,13 +2579,13 @@
         <w:tblLook w:firstColumn="1" w:firstRow="1" w:lastColumn="0" w:lastRow="0" w:noHBand="0" w:noVBand="1" w:val="04A0"/>
       </w:tblPr>
       <w:tblGrid>
-        <w:gridCol w:w="4514"/>
-        <w:gridCol w:w="4514"/>
+        <w:gridCol w:w="4730"/>
+        <w:gridCol w:w="4730"/>
       </w:tblGrid>
       <w:tr>
         <w:tc>
           <w:tcPr>
-            <w:tcW w:type="dxa" w:w="4514"/>
+            <w:tcW w:type="dxa" w:w="4730"/>
             <w:shd w:fill="1F4E79" w:val="clear"/>
           </w:tcPr>
           <w:p>
@@ -2061,7 +2612,7 @@
         </w:tc>
         <w:tc>
           <w:tcPr>
-            <w:tcW w:type="dxa" w:w="4514"/>
+            <w:tcW w:type="dxa" w:w="4730"/>
             <w:shd w:fill="1F4E79" w:val="clear"/>
           </w:tcPr>
           <w:p>
@@ -2090,7 +2641,7 @@
       <w:tr>
         <w:tc>
           <w:tcPr>
-            <w:tcW w:type="dxa" w:w="4514"/>
+            <w:tcW w:type="dxa" w:w="4730"/>
           </w:tcPr>
           <w:p>
             <w:pPr>
@@ -2111,7 +2662,7 @@
         </w:tc>
         <w:tc>
           <w:tcPr>
-            <w:tcW w:type="dxa" w:w="4514"/>
+            <w:tcW w:type="dxa" w:w="4730"/>
           </w:tcPr>
           <w:p>
             <w:pPr>
@@ -2134,7 +2685,7 @@
       <w:tr>
         <w:tc>
           <w:tcPr>
-            <w:tcW w:type="dxa" w:w="4514"/>
+            <w:tcW w:type="dxa" w:w="4730"/>
           </w:tcPr>
           <w:p>
             <w:pPr>
@@ -2155,7 +2706,7 @@
         </w:tc>
         <w:tc>
           <w:tcPr>
-            <w:tcW w:type="dxa" w:w="4514"/>
+            <w:tcW w:type="dxa" w:w="4730"/>
           </w:tcPr>
           <w:p>
             <w:pPr>
@@ -2178,7 +2729,7 @@
       <w:tr>
         <w:tc>
           <w:tcPr>
-            <w:tcW w:type="dxa" w:w="4514"/>
+            <w:tcW w:type="dxa" w:w="4730"/>
           </w:tcPr>
           <w:p>
             <w:pPr>
@@ -2199,7 +2750,7 @@
         </w:tc>
         <w:tc>
           <w:tcPr>
-            <w:tcW w:type="dxa" w:w="4514"/>
+            <w:tcW w:type="dxa" w:w="4730"/>
           </w:tcPr>
           <w:p>
             <w:pPr>
@@ -2222,7 +2773,7 @@
       <w:tr>
         <w:tc>
           <w:tcPr>
-            <w:tcW w:type="dxa" w:w="4514"/>
+            <w:tcW w:type="dxa" w:w="4730"/>
           </w:tcPr>
           <w:p>
             <w:pPr>
@@ -2243,7 +2794,7 @@
         </w:tc>
         <w:tc>
           <w:tcPr>
-            <w:tcW w:type="dxa" w:w="4514"/>
+            <w:tcW w:type="dxa" w:w="4730"/>
           </w:tcPr>
           <w:p>
             <w:pPr>
@@ -2266,7 +2817,7 @@
       <w:tr>
         <w:tc>
           <w:tcPr>
-            <w:tcW w:type="dxa" w:w="4514"/>
+            <w:tcW w:type="dxa" w:w="4730"/>
           </w:tcPr>
           <w:p>
             <w:pPr>
@@ -2287,7 +2838,7 @@
         </w:tc>
         <w:tc>
           <w:tcPr>
-            <w:tcW w:type="dxa" w:w="4514"/>
+            <w:tcW w:type="dxa" w:w="4730"/>
           </w:tcPr>
           <w:p>
             <w:pPr>
@@ -2310,7 +2861,7 @@
       <w:tr>
         <w:tc>
           <w:tcPr>
-            <w:tcW w:type="dxa" w:w="4514"/>
+            <w:tcW w:type="dxa" w:w="4730"/>
           </w:tcPr>
           <w:p>
             <w:pPr>
@@ -2331,7 +2882,7 @@
         </w:tc>
         <w:tc>
           <w:tcPr>
-            <w:tcW w:type="dxa" w:w="4514"/>
+            <w:tcW w:type="dxa" w:w="4730"/>
           </w:tcPr>
           <w:p>
             <w:pPr>
@@ -2354,7 +2905,7 @@
       <w:tr>
         <w:tc>
           <w:tcPr>
-            <w:tcW w:type="dxa" w:w="4514"/>
+            <w:tcW w:type="dxa" w:w="4730"/>
           </w:tcPr>
           <w:p>
             <w:pPr>
@@ -2375,7 +2926,7 @@
         </w:tc>
         <w:tc>
           <w:tcPr>
-            <w:tcW w:type="dxa" w:w="4514"/>
+            <w:tcW w:type="dxa" w:w="4730"/>
           </w:tcPr>
           <w:p>
             <w:pPr>
@@ -2398,7 +2949,7 @@
       <w:tr>
         <w:tc>
           <w:tcPr>
-            <w:tcW w:type="dxa" w:w="4514"/>
+            <w:tcW w:type="dxa" w:w="4730"/>
           </w:tcPr>
           <w:p>
             <w:pPr>
@@ -2419,7 +2970,7 @@
         </w:tc>
         <w:tc>
           <w:tcPr>
-            <w:tcW w:type="dxa" w:w="4514"/>
+            <w:tcW w:type="dxa" w:w="4730"/>
           </w:tcPr>
           <w:p>
             <w:pPr>
@@ -2442,7 +2993,7 @@
       <w:tr>
         <w:tc>
           <w:tcPr>
-            <w:tcW w:type="dxa" w:w="4514"/>
+            <w:tcW w:type="dxa" w:w="4730"/>
           </w:tcPr>
           <w:p>
             <w:pPr>
@@ -2463,7 +3014,7 @@
         </w:tc>
         <w:tc>
           <w:tcPr>
-            <w:tcW w:type="dxa" w:w="4514"/>
+            <w:tcW w:type="dxa" w:w="4730"/>
           </w:tcPr>
           <w:p>
             <w:pPr>
@@ -2486,7 +3037,7 @@
       <w:tr>
         <w:tc>
           <w:tcPr>
-            <w:tcW w:type="dxa" w:w="4514"/>
+            <w:tcW w:type="dxa" w:w="4730"/>
           </w:tcPr>
           <w:p>
             <w:pPr>
@@ -2507,7 +3058,7 @@
         </w:tc>
         <w:tc>
           <w:tcPr>
-            <w:tcW w:type="dxa" w:w="4514"/>
+            <w:tcW w:type="dxa" w:w="4730"/>
           </w:tcPr>
           <w:p>
             <w:pPr>
@@ -2531,8 +3082,8 @@
     <w:p/>
     <w:p>
       <w:pPr>
-        <w:spacing w:after="160" w:before="0" w:line="360" w:lineRule="auto"/>
-        <w:ind w:firstLine="432"/>
+        <w:spacing w:after="80" w:before="0" w:line="259" w:lineRule="auto"/>
+        <w:ind w:firstLine="288"/>
         <w:jc w:val="both"/>
       </w:pPr>
       <w:r>
@@ -2554,7 +3105,7 @@
       <w:r>
         <w:drawing>
           <wp:inline xmlns:a="http://schemas.openxmlformats.org/drawingml/2006/main" xmlns:pic="http://schemas.openxmlformats.org/drawingml/2006/picture">
-            <wp:extent cx="5760720" cy="5299247"/>
+            <wp:extent cx="3578502" cy="3291840"/>
             <wp:docPr id="2" name="Picture 2"/>
             <wp:cNvGraphicFramePr>
               <a:graphicFrameLocks noChangeAspect="1"/>
@@ -2575,7 +3126,7 @@
                   <pic:spPr>
                     <a:xfrm>
                       <a:off x="0" y="0"/>
-                      <a:ext cx="5760720" cy="5299247"/>
+                      <a:ext cx="3578502" cy="3291840"/>
                     </a:xfrm>
                     <a:prstGeom prst="rect"/>
                   </pic:spPr>
@@ -2605,8 +3156,8 @@
     </w:p>
     <w:p>
       <w:pPr>
-        <w:spacing w:after="160" w:before="0" w:line="360" w:lineRule="auto"/>
-        <w:ind w:firstLine="432"/>
+        <w:spacing w:after="80" w:before="0" w:line="259" w:lineRule="auto"/>
+        <w:ind w:firstLine="288"/>
         <w:jc w:val="both"/>
       </w:pPr>
       <w:r>
@@ -2628,7 +3179,7 @@
       <w:r>
         <w:drawing>
           <wp:inline xmlns:a="http://schemas.openxmlformats.org/drawingml/2006/main" xmlns:pic="http://schemas.openxmlformats.org/drawingml/2006/picture">
-            <wp:extent cx="5760720" cy="3881935"/>
+            <wp:extent cx="4885030" cy="3291840"/>
             <wp:docPr id="3" name="Picture 3"/>
             <wp:cNvGraphicFramePr>
               <a:graphicFrameLocks noChangeAspect="1"/>
@@ -2649,7 +3200,7 @@
                   <pic:spPr>
                     <a:xfrm>
                       <a:off x="0" y="0"/>
-                      <a:ext cx="5760720" cy="3881935"/>
+                      <a:ext cx="4885030" cy="3291840"/>
                     </a:xfrm>
                     <a:prstGeom prst="rect"/>
                   </pic:spPr>
@@ -2679,8 +3230,8 @@
     </w:p>
     <w:p>
       <w:pPr>
-        <w:spacing w:after="160" w:before="0" w:line="360" w:lineRule="auto"/>
-        <w:ind w:firstLine="432"/>
+        <w:spacing w:after="80" w:before="0" w:line="259" w:lineRule="auto"/>
+        <w:ind w:firstLine="288"/>
         <w:jc w:val="both"/>
       </w:pPr>
       <w:r>
@@ -2702,7 +3253,7 @@
       <w:r>
         <w:drawing>
           <wp:inline xmlns:a="http://schemas.openxmlformats.org/drawingml/2006/main" xmlns:pic="http://schemas.openxmlformats.org/drawingml/2006/picture">
-            <wp:extent cx="5760720" cy="6211069"/>
+            <wp:extent cx="3053156" cy="3291839"/>
             <wp:docPr id="4" name="Picture 4"/>
             <wp:cNvGraphicFramePr>
               <a:graphicFrameLocks noChangeAspect="1"/>
@@ -2723,7 +3274,7 @@
                   <pic:spPr>
                     <a:xfrm>
                       <a:off x="0" y="0"/>
-                      <a:ext cx="5760720" cy="6211069"/>
+                      <a:ext cx="3053156" cy="3291839"/>
                     </a:xfrm>
                     <a:prstGeom prst="rect"/>
                   </pic:spPr>
@@ -2753,8 +3304,8 @@
     </w:p>
     <w:p>
       <w:pPr>
-        <w:spacing w:after="160" w:before="0" w:line="360" w:lineRule="auto"/>
-        <w:ind w:firstLine="432"/>
+        <w:spacing w:after="80" w:before="0" w:line="259" w:lineRule="auto"/>
+        <w:ind w:firstLine="288"/>
         <w:jc w:val="both"/>
       </w:pPr>
       <w:r>
@@ -2770,7 +3321,7 @@
     </w:p>
     <w:p>
       <w:pPr>
-        <w:spacing w:before="240" w:after="160" w:line="276" w:lineRule="auto"/>
+        <w:spacing w:before="160" w:after="80" w:line="240" w:lineRule="auto"/>
         <w:ind w:firstLine="0"/>
         <w:jc w:val="left"/>
       </w:pPr>
@@ -2780,15 +3331,15 @@
           <w:b/>
           <w:i w:val="0"/>
           <w:color w:val="000000"/>
-          <w:sz w:val="28"/>
+          <w:sz w:val="24"/>
         </w:rPr>
         <w:t>3.2  Dataset</w:t>
       </w:r>
     </w:p>
     <w:p>
       <w:pPr>
-        <w:spacing w:after="160" w:before="0" w:line="360" w:lineRule="auto"/>
-        <w:ind w:firstLine="432"/>
+        <w:spacing w:after="80" w:before="0" w:line="259" w:lineRule="auto"/>
+        <w:ind w:firstLine="288"/>
         <w:jc w:val="both"/>
       </w:pPr>
       <w:r>
@@ -2825,15 +3376,15 @@
         <w:tblLook w:firstColumn="1" w:firstRow="1" w:lastColumn="0" w:lastRow="0" w:noHBand="0" w:noVBand="1" w:val="04A0"/>
       </w:tblPr>
       <w:tblGrid>
-        <w:gridCol w:w="2257"/>
-        <w:gridCol w:w="2257"/>
-        <w:gridCol w:w="2257"/>
-        <w:gridCol w:w="2257"/>
+        <w:gridCol w:w="2365"/>
+        <w:gridCol w:w="2365"/>
+        <w:gridCol w:w="2365"/>
+        <w:gridCol w:w="2365"/>
       </w:tblGrid>
       <w:tr>
         <w:tc>
           <w:tcPr>
-            <w:tcW w:type="dxa" w:w="2257"/>
+            <w:tcW w:type="dxa" w:w="2365"/>
             <w:shd w:fill="1F4E79" w:val="clear"/>
           </w:tcPr>
           <w:p>
@@ -2860,7 +3411,7 @@
         </w:tc>
         <w:tc>
           <w:tcPr>
-            <w:tcW w:type="dxa" w:w="2257"/>
+            <w:tcW w:type="dxa" w:w="2365"/>
             <w:shd w:fill="1F4E79" w:val="clear"/>
           </w:tcPr>
           <w:p>
@@ -2887,7 +3438,7 @@
         </w:tc>
         <w:tc>
           <w:tcPr>
-            <w:tcW w:type="dxa" w:w="2257"/>
+            <w:tcW w:type="dxa" w:w="2365"/>
             <w:shd w:fill="1F4E79" w:val="clear"/>
           </w:tcPr>
           <w:p>
@@ -2914,7 +3465,7 @@
         </w:tc>
         <w:tc>
           <w:tcPr>
-            <w:tcW w:type="dxa" w:w="2257"/>
+            <w:tcW w:type="dxa" w:w="2365"/>
             <w:shd w:fill="1F4E79" w:val="clear"/>
           </w:tcPr>
           <w:p>
@@ -2943,7 +3494,7 @@
       <w:tr>
         <w:tc>
           <w:tcPr>
-            <w:tcW w:type="dxa" w:w="2257"/>
+            <w:tcW w:type="dxa" w:w="2365"/>
           </w:tcPr>
           <w:p>
             <w:pPr>
@@ -2964,7 +3515,7 @@
         </w:tc>
         <w:tc>
           <w:tcPr>
-            <w:tcW w:type="dxa" w:w="2257"/>
+            <w:tcW w:type="dxa" w:w="2365"/>
           </w:tcPr>
           <w:p>
             <w:pPr>
@@ -2985,7 +3536,7 @@
         </w:tc>
         <w:tc>
           <w:tcPr>
-            <w:tcW w:type="dxa" w:w="2257"/>
+            <w:tcW w:type="dxa" w:w="2365"/>
           </w:tcPr>
           <w:p>
             <w:pPr>
@@ -3006,7 +3557,7 @@
         </w:tc>
         <w:tc>
           <w:tcPr>
-            <w:tcW w:type="dxa" w:w="2257"/>
+            <w:tcW w:type="dxa" w:w="2365"/>
           </w:tcPr>
           <w:p>
             <w:pPr>
@@ -3029,7 +3580,7 @@
       <w:tr>
         <w:tc>
           <w:tcPr>
-            <w:tcW w:type="dxa" w:w="2257"/>
+            <w:tcW w:type="dxa" w:w="2365"/>
           </w:tcPr>
           <w:p>
             <w:pPr>
@@ -3050,7 +3601,7 @@
         </w:tc>
         <w:tc>
           <w:tcPr>
-            <w:tcW w:type="dxa" w:w="2257"/>
+            <w:tcW w:type="dxa" w:w="2365"/>
           </w:tcPr>
           <w:p>
             <w:pPr>
@@ -3071,7 +3622,7 @@
         </w:tc>
         <w:tc>
           <w:tcPr>
-            <w:tcW w:type="dxa" w:w="2257"/>
+            <w:tcW w:type="dxa" w:w="2365"/>
           </w:tcPr>
           <w:p>
             <w:pPr>
@@ -3092,7 +3643,7 @@
         </w:tc>
         <w:tc>
           <w:tcPr>
-            <w:tcW w:type="dxa" w:w="2257"/>
+            <w:tcW w:type="dxa" w:w="2365"/>
           </w:tcPr>
           <w:p>
             <w:pPr>
@@ -3115,7 +3666,7 @@
       <w:tr>
         <w:tc>
           <w:tcPr>
-            <w:tcW w:type="dxa" w:w="2257"/>
+            <w:tcW w:type="dxa" w:w="2365"/>
           </w:tcPr>
           <w:p>
             <w:pPr>
@@ -3136,7 +3687,7 @@
         </w:tc>
         <w:tc>
           <w:tcPr>
-            <w:tcW w:type="dxa" w:w="2257"/>
+            <w:tcW w:type="dxa" w:w="2365"/>
           </w:tcPr>
           <w:p>
             <w:pPr>
@@ -3157,7 +3708,7 @@
         </w:tc>
         <w:tc>
           <w:tcPr>
-            <w:tcW w:type="dxa" w:w="2257"/>
+            <w:tcW w:type="dxa" w:w="2365"/>
           </w:tcPr>
           <w:p>
             <w:pPr>
@@ -3178,7 +3729,7 @@
         </w:tc>
         <w:tc>
           <w:tcPr>
-            <w:tcW w:type="dxa" w:w="2257"/>
+            <w:tcW w:type="dxa" w:w="2365"/>
           </w:tcPr>
           <w:p>
             <w:pPr>
@@ -3208,7 +3759,7 @@
       <w:r>
         <w:drawing>
           <wp:inline xmlns:a="http://schemas.openxmlformats.org/drawingml/2006/main" xmlns:pic="http://schemas.openxmlformats.org/drawingml/2006/picture">
-            <wp:extent cx="5760720" cy="6008197"/>
+            <wp:extent cx="3156249" cy="3291840"/>
             <wp:docPr id="5" name="Picture 5"/>
             <wp:cNvGraphicFramePr>
               <a:graphicFrameLocks noChangeAspect="1"/>
@@ -3229,7 +3780,7 @@
                   <pic:spPr>
                     <a:xfrm>
                       <a:off x="0" y="0"/>
-                      <a:ext cx="5760720" cy="6008197"/>
+                      <a:ext cx="3156249" cy="3291840"/>
                     </a:xfrm>
                     <a:prstGeom prst="rect"/>
                   </pic:spPr>
@@ -3259,8 +3810,8 @@
     </w:p>
     <w:p>
       <w:pPr>
-        <w:spacing w:after="160" w:before="0" w:line="360" w:lineRule="auto"/>
-        <w:ind w:firstLine="432"/>
+        <w:spacing w:after="80" w:before="0" w:line="259" w:lineRule="auto"/>
+        <w:ind w:firstLine="288"/>
         <w:jc w:val="both"/>
       </w:pPr>
       <w:r>
@@ -3276,7 +3827,7 @@
     </w:p>
     <w:p>
       <w:pPr>
-        <w:spacing w:before="240" w:after="160" w:line="276" w:lineRule="auto"/>
+        <w:spacing w:before="160" w:after="80" w:line="240" w:lineRule="auto"/>
         <w:ind w:firstLine="0"/>
         <w:jc w:val="left"/>
       </w:pPr>
@@ -3286,15 +3837,15 @@
           <w:b/>
           <w:i w:val="0"/>
           <w:color w:val="000000"/>
-          <w:sz w:val="28"/>
+          <w:sz w:val="24"/>
         </w:rPr>
         <w:t>3.3  Procedure and Parameters</w:t>
       </w:r>
     </w:p>
     <w:p>
       <w:pPr>
-        <w:spacing w:after="160" w:before="0" w:line="360" w:lineRule="auto"/>
-        <w:ind w:firstLine="432"/>
+        <w:spacing w:after="80" w:before="0" w:line="259" w:lineRule="auto"/>
+        <w:ind w:firstLine="288"/>
         <w:jc w:val="both"/>
       </w:pPr>
       <w:r>
@@ -3310,8 +3861,8 @@
     </w:p>
     <w:p>
       <w:pPr>
-        <w:spacing w:after="160" w:before="0" w:line="360" w:lineRule="auto"/>
-        <w:ind w:firstLine="432"/>
+        <w:spacing w:after="80" w:before="0" w:line="259" w:lineRule="auto"/>
+        <w:ind w:firstLine="288"/>
         <w:jc w:val="both"/>
       </w:pPr>
       <w:r>
@@ -3327,8 +3878,8 @@
     </w:p>
     <w:p>
       <w:pPr>
-        <w:spacing w:after="160" w:before="0" w:line="360" w:lineRule="auto"/>
-        <w:ind w:firstLine="432"/>
+        <w:spacing w:after="80" w:before="0" w:line="259" w:lineRule="auto"/>
+        <w:ind w:firstLine="288"/>
         <w:jc w:val="both"/>
       </w:pPr>
       <w:r>
@@ -3344,8 +3895,8 @@
     </w:p>
     <w:p>
       <w:pPr>
-        <w:spacing w:after="160" w:before="0" w:line="360" w:lineRule="auto"/>
-        <w:ind w:firstLine="432"/>
+        <w:spacing w:after="80" w:before="0" w:line="259" w:lineRule="auto"/>
+        <w:ind w:firstLine="288"/>
         <w:jc w:val="both"/>
       </w:pPr>
       <w:r>
@@ -3366,7 +3917,7 @@
     </w:p>
     <w:p>
       <w:pPr>
-        <w:spacing w:before="240" w:after="160" w:line="276" w:lineRule="auto"/>
+        <w:spacing w:before="160" w:after="80" w:line="240" w:lineRule="auto"/>
         <w:ind w:firstLine="0"/>
         <w:jc w:val="left"/>
       </w:pPr>
@@ -3376,15 +3927,15 @@
           <w:b/>
           <w:i w:val="0"/>
           <w:color w:val="000000"/>
-          <w:sz w:val="32"/>
+          <w:sz w:val="28"/>
         </w:rPr>
         <w:t>CHAPTER 4  RESULTS AND DISCUSSION</w:t>
       </w:r>
     </w:p>
     <w:p>
       <w:pPr>
-        <w:spacing w:after="160" w:before="0" w:line="360" w:lineRule="auto"/>
-        <w:ind w:firstLine="432"/>
+        <w:spacing w:after="80" w:before="0" w:line="259" w:lineRule="auto"/>
+        <w:ind w:firstLine="288"/>
         <w:jc w:val="both"/>
       </w:pPr>
       <w:r>
@@ -3406,7 +3957,7 @@
       <w:r>
         <w:drawing>
           <wp:inline xmlns:a="http://schemas.openxmlformats.org/drawingml/2006/main" xmlns:pic="http://schemas.openxmlformats.org/drawingml/2006/picture">
-            <wp:extent cx="5760720" cy="6291816"/>
+            <wp:extent cx="3013973" cy="3291839"/>
             <wp:docPr id="6" name="Picture 6"/>
             <wp:cNvGraphicFramePr>
               <a:graphicFrameLocks noChangeAspect="1"/>
@@ -3427,7 +3978,7 @@
                   <pic:spPr>
                     <a:xfrm>
                       <a:off x="0" y="0"/>
-                      <a:ext cx="5760720" cy="6291816"/>
+                      <a:ext cx="3013973" cy="3291839"/>
                     </a:xfrm>
                     <a:prstGeom prst="rect"/>
                   </pic:spPr>
@@ -3463,7 +4014,7 @@
       <w:r>
         <w:drawing>
           <wp:inline xmlns:a="http://schemas.openxmlformats.org/drawingml/2006/main" xmlns:pic="http://schemas.openxmlformats.org/drawingml/2006/picture">
-            <wp:extent cx="5196419" cy="6766560"/>
+            <wp:extent cx="2527987" cy="3291839"/>
             <wp:docPr id="7" name="Picture 7"/>
             <wp:cNvGraphicFramePr>
               <a:graphicFrameLocks noChangeAspect="1"/>
@@ -3484,7 +4035,7 @@
                   <pic:spPr>
                     <a:xfrm>
                       <a:off x="0" y="0"/>
-                      <a:ext cx="5196419" cy="6766560"/>
+                      <a:ext cx="2527987" cy="3291839"/>
                     </a:xfrm>
                     <a:prstGeom prst="rect"/>
                   </pic:spPr>
@@ -3514,8 +4065,8 @@
     </w:p>
     <w:p>
       <w:pPr>
-        <w:spacing w:after="160" w:before="0" w:line="360" w:lineRule="auto"/>
-        <w:ind w:firstLine="432"/>
+        <w:spacing w:after="80" w:before="0" w:line="259" w:lineRule="auto"/>
+        <w:ind w:firstLine="288"/>
         <w:jc w:val="both"/>
       </w:pPr>
       <w:r>
@@ -3537,7 +4088,7 @@
       <w:r>
         <w:drawing>
           <wp:inline xmlns:a="http://schemas.openxmlformats.org/drawingml/2006/main" xmlns:pic="http://schemas.openxmlformats.org/drawingml/2006/picture">
-            <wp:extent cx="5760720" cy="4401392"/>
+            <wp:extent cx="4308493" cy="3291840"/>
             <wp:docPr id="8" name="Picture 8"/>
             <wp:cNvGraphicFramePr>
               <a:graphicFrameLocks noChangeAspect="1"/>
@@ -3558,7 +4109,7 @@
                   <pic:spPr>
                     <a:xfrm>
                       <a:off x="0" y="0"/>
-                      <a:ext cx="5760720" cy="4401392"/>
+                      <a:ext cx="4308493" cy="3291840"/>
                     </a:xfrm>
                     <a:prstGeom prst="rect"/>
                   </pic:spPr>
@@ -3594,7 +4145,7 @@
       <w:r>
         <w:drawing>
           <wp:inline xmlns:a="http://schemas.openxmlformats.org/drawingml/2006/main" xmlns:pic="http://schemas.openxmlformats.org/drawingml/2006/picture">
-            <wp:extent cx="5760720" cy="5194721"/>
+            <wp:extent cx="3650507" cy="3291839"/>
             <wp:docPr id="9" name="Picture 9"/>
             <wp:cNvGraphicFramePr>
               <a:graphicFrameLocks noChangeAspect="1"/>
@@ -3615,7 +4166,7 @@
                   <pic:spPr>
                     <a:xfrm>
                       <a:off x="0" y="0"/>
-                      <a:ext cx="5760720" cy="5194721"/>
+                      <a:ext cx="3650507" cy="3291839"/>
                     </a:xfrm>
                     <a:prstGeom prst="rect"/>
                   </pic:spPr>
@@ -3651,7 +4202,7 @@
       <w:r>
         <w:drawing>
           <wp:inline xmlns:a="http://schemas.openxmlformats.org/drawingml/2006/main" xmlns:pic="http://schemas.openxmlformats.org/drawingml/2006/picture">
-            <wp:extent cx="5760720" cy="5017551"/>
+            <wp:extent cx="3779407" cy="3291840"/>
             <wp:docPr id="10" name="Picture 10"/>
             <wp:cNvGraphicFramePr>
               <a:graphicFrameLocks noChangeAspect="1"/>
@@ -3672,7 +4223,7 @@
                   <pic:spPr>
                     <a:xfrm>
                       <a:off x="0" y="0"/>
-                      <a:ext cx="5760720" cy="5017551"/>
+                      <a:ext cx="3779407" cy="3291840"/>
                     </a:xfrm>
                     <a:prstGeom prst="rect"/>
                   </pic:spPr>
@@ -3702,8 +4253,8 @@
     </w:p>
     <w:p>
       <w:pPr>
-        <w:spacing w:after="160" w:before="0" w:line="360" w:lineRule="auto"/>
-        <w:ind w:firstLine="432"/>
+        <w:spacing w:after="80" w:before="0" w:line="259" w:lineRule="auto"/>
+        <w:ind w:firstLine="288"/>
         <w:jc w:val="both"/>
       </w:pPr>
       <w:r>
@@ -3725,7 +4276,7 @@
       <w:r>
         <w:drawing>
           <wp:inline xmlns:a="http://schemas.openxmlformats.org/drawingml/2006/main" xmlns:pic="http://schemas.openxmlformats.org/drawingml/2006/picture">
-            <wp:extent cx="5760720" cy="4759858"/>
+            <wp:extent cx="3984019" cy="3291840"/>
             <wp:docPr id="11" name="Picture 11"/>
             <wp:cNvGraphicFramePr>
               <a:graphicFrameLocks noChangeAspect="1"/>
@@ -3746,7 +4297,7 @@
                   <pic:spPr>
                     <a:xfrm>
                       <a:off x="0" y="0"/>
-                      <a:ext cx="5760720" cy="4759858"/>
+                      <a:ext cx="3984019" cy="3291840"/>
                     </a:xfrm>
                     <a:prstGeom prst="rect"/>
                   </pic:spPr>
@@ -3782,7 +4333,7 @@
       <w:r>
         <w:drawing>
           <wp:inline xmlns:a="http://schemas.openxmlformats.org/drawingml/2006/main" xmlns:pic="http://schemas.openxmlformats.org/drawingml/2006/picture">
-            <wp:extent cx="5760720" cy="4430958"/>
+            <wp:extent cx="4279744" cy="3291839"/>
             <wp:docPr id="12" name="Picture 12"/>
             <wp:cNvGraphicFramePr>
               <a:graphicFrameLocks noChangeAspect="1"/>
@@ -3803,7 +4354,7 @@
                   <pic:spPr>
                     <a:xfrm>
                       <a:off x="0" y="0"/>
-                      <a:ext cx="5760720" cy="4430958"/>
+                      <a:ext cx="4279744" cy="3291839"/>
                     </a:xfrm>
                     <a:prstGeom prst="rect"/>
                   </pic:spPr>
@@ -3833,8 +4384,8 @@
     </w:p>
     <w:p>
       <w:pPr>
-        <w:spacing w:after="160" w:before="0" w:line="360" w:lineRule="auto"/>
-        <w:ind w:firstLine="432"/>
+        <w:spacing w:after="80" w:before="0" w:line="259" w:lineRule="auto"/>
+        <w:ind w:firstLine="288"/>
         <w:jc w:val="both"/>
       </w:pPr>
       <w:r>
@@ -3871,17 +4422,17 @@
         <w:tblLook w:firstColumn="1" w:firstRow="1" w:lastColumn="0" w:lastRow="0" w:noHBand="0" w:noVBand="1" w:val="04A0"/>
       </w:tblPr>
       <w:tblGrid>
-        <w:gridCol w:w="1505"/>
-        <w:gridCol w:w="1505"/>
-        <w:gridCol w:w="1505"/>
-        <w:gridCol w:w="1505"/>
-        <w:gridCol w:w="1505"/>
-        <w:gridCol w:w="1505"/>
+        <w:gridCol w:w="1577"/>
+        <w:gridCol w:w="1577"/>
+        <w:gridCol w:w="1577"/>
+        <w:gridCol w:w="1577"/>
+        <w:gridCol w:w="1577"/>
+        <w:gridCol w:w="1577"/>
       </w:tblGrid>
       <w:tr>
         <w:tc>
           <w:tcPr>
-            <w:tcW w:type="dxa" w:w="1505"/>
+            <w:tcW w:type="dxa" w:w="1577"/>
             <w:shd w:fill="1F4E79" w:val="clear"/>
           </w:tcPr>
           <w:p>
@@ -3908,7 +4459,7 @@
         </w:tc>
         <w:tc>
           <w:tcPr>
-            <w:tcW w:type="dxa" w:w="1505"/>
+            <w:tcW w:type="dxa" w:w="1577"/>
             <w:shd w:fill="1F4E79" w:val="clear"/>
           </w:tcPr>
           <w:p>
@@ -3935,7 +4486,7 @@
         </w:tc>
         <w:tc>
           <w:tcPr>
-            <w:tcW w:type="dxa" w:w="1505"/>
+            <w:tcW w:type="dxa" w:w="1577"/>
             <w:shd w:fill="1F4E79" w:val="clear"/>
           </w:tcPr>
           <w:p>
@@ -3962,7 +4513,7 @@
         </w:tc>
         <w:tc>
           <w:tcPr>
-            <w:tcW w:type="dxa" w:w="1505"/>
+            <w:tcW w:type="dxa" w:w="1577"/>
             <w:shd w:fill="1F4E79" w:val="clear"/>
           </w:tcPr>
           <w:p>
@@ -3989,7 +4540,7 @@
         </w:tc>
         <w:tc>
           <w:tcPr>
-            <w:tcW w:type="dxa" w:w="1505"/>
+            <w:tcW w:type="dxa" w:w="1577"/>
             <w:shd w:fill="1F4E79" w:val="clear"/>
           </w:tcPr>
           <w:p>
@@ -4016,7 +4567,7 @@
         </w:tc>
         <w:tc>
           <w:tcPr>
-            <w:tcW w:type="dxa" w:w="1505"/>
+            <w:tcW w:type="dxa" w:w="1577"/>
             <w:shd w:fill="1F4E79" w:val="clear"/>
           </w:tcPr>
           <w:p>
@@ -4045,7 +4596,7 @@
       <w:tr>
         <w:tc>
           <w:tcPr>
-            <w:tcW w:type="dxa" w:w="1505"/>
+            <w:tcW w:type="dxa" w:w="1577"/>
           </w:tcPr>
           <w:p>
             <w:pPr>
@@ -4066,7 +4617,7 @@
         </w:tc>
         <w:tc>
           <w:tcPr>
-            <w:tcW w:type="dxa" w:w="1505"/>
+            <w:tcW w:type="dxa" w:w="1577"/>
           </w:tcPr>
           <w:p>
             <w:pPr>
@@ -4087,7 +4638,7 @@
         </w:tc>
         <w:tc>
           <w:tcPr>
-            <w:tcW w:type="dxa" w:w="1505"/>
+            <w:tcW w:type="dxa" w:w="1577"/>
           </w:tcPr>
           <w:p>
             <w:pPr>
@@ -4108,7 +4659,7 @@
         </w:tc>
         <w:tc>
           <w:tcPr>
-            <w:tcW w:type="dxa" w:w="1505"/>
+            <w:tcW w:type="dxa" w:w="1577"/>
           </w:tcPr>
           <w:p>
             <w:pPr>
@@ -4129,7 +4680,7 @@
         </w:tc>
         <w:tc>
           <w:tcPr>
-            <w:tcW w:type="dxa" w:w="1505"/>
+            <w:tcW w:type="dxa" w:w="1577"/>
           </w:tcPr>
           <w:p>
             <w:pPr>
@@ -4150,7 +4701,7 @@
         </w:tc>
         <w:tc>
           <w:tcPr>
-            <w:tcW w:type="dxa" w:w="1505"/>
+            <w:tcW w:type="dxa" w:w="1577"/>
           </w:tcPr>
           <w:p>
             <w:pPr>
@@ -4173,7 +4724,7 @@
       <w:tr>
         <w:tc>
           <w:tcPr>
-            <w:tcW w:type="dxa" w:w="1505"/>
+            <w:tcW w:type="dxa" w:w="1577"/>
           </w:tcPr>
           <w:p>
             <w:pPr>
@@ -4194,7 +4745,7 @@
         </w:tc>
         <w:tc>
           <w:tcPr>
-            <w:tcW w:type="dxa" w:w="1505"/>
+            <w:tcW w:type="dxa" w:w="1577"/>
           </w:tcPr>
           <w:p>
             <w:pPr>
@@ -4215,7 +4766,7 @@
         </w:tc>
         <w:tc>
           <w:tcPr>
-            <w:tcW w:type="dxa" w:w="1505"/>
+            <w:tcW w:type="dxa" w:w="1577"/>
           </w:tcPr>
           <w:p>
             <w:pPr>
@@ -4236,7 +4787,7 @@
         </w:tc>
         <w:tc>
           <w:tcPr>
-            <w:tcW w:type="dxa" w:w="1505"/>
+            <w:tcW w:type="dxa" w:w="1577"/>
           </w:tcPr>
           <w:p>
             <w:pPr>
@@ -4257,7 +4808,7 @@
         </w:tc>
         <w:tc>
           <w:tcPr>
-            <w:tcW w:type="dxa" w:w="1505"/>
+            <w:tcW w:type="dxa" w:w="1577"/>
           </w:tcPr>
           <w:p>
             <w:pPr>
@@ -4278,7 +4829,7 @@
         </w:tc>
         <w:tc>
           <w:tcPr>
-            <w:tcW w:type="dxa" w:w="1505"/>
+            <w:tcW w:type="dxa" w:w="1577"/>
           </w:tcPr>
           <w:p>
             <w:pPr>
@@ -4301,7 +4852,7 @@
       <w:tr>
         <w:tc>
           <w:tcPr>
-            <w:tcW w:type="dxa" w:w="1505"/>
+            <w:tcW w:type="dxa" w:w="1577"/>
           </w:tcPr>
           <w:p>
             <w:pPr>
@@ -4322,7 +4873,7 @@
         </w:tc>
         <w:tc>
           <w:tcPr>
-            <w:tcW w:type="dxa" w:w="1505"/>
+            <w:tcW w:type="dxa" w:w="1577"/>
           </w:tcPr>
           <w:p>
             <w:pPr>
@@ -4343,7 +4894,7 @@
         </w:tc>
         <w:tc>
           <w:tcPr>
-            <w:tcW w:type="dxa" w:w="1505"/>
+            <w:tcW w:type="dxa" w:w="1577"/>
           </w:tcPr>
           <w:p>
             <w:pPr>
@@ -4364,7 +4915,7 @@
         </w:tc>
         <w:tc>
           <w:tcPr>
-            <w:tcW w:type="dxa" w:w="1505"/>
+            <w:tcW w:type="dxa" w:w="1577"/>
           </w:tcPr>
           <w:p>
             <w:pPr>
@@ -4385,7 +4936,7 @@
         </w:tc>
         <w:tc>
           <w:tcPr>
-            <w:tcW w:type="dxa" w:w="1505"/>
+            <w:tcW w:type="dxa" w:w="1577"/>
           </w:tcPr>
           <w:p>
             <w:pPr>
@@ -4406,7 +4957,7 @@
         </w:tc>
         <w:tc>
           <w:tcPr>
-            <w:tcW w:type="dxa" w:w="1505"/>
+            <w:tcW w:type="dxa" w:w="1577"/>
           </w:tcPr>
           <w:p>
             <w:pPr>
@@ -4429,7 +4980,7 @@
       <w:tr>
         <w:tc>
           <w:tcPr>
-            <w:tcW w:type="dxa" w:w="1505"/>
+            <w:tcW w:type="dxa" w:w="1577"/>
           </w:tcPr>
           <w:p>
             <w:pPr>
@@ -4450,7 +5001,7 @@
         </w:tc>
         <w:tc>
           <w:tcPr>
-            <w:tcW w:type="dxa" w:w="1505"/>
+            <w:tcW w:type="dxa" w:w="1577"/>
           </w:tcPr>
           <w:p>
             <w:pPr>
@@ -4471,7 +5022,7 @@
         </w:tc>
         <w:tc>
           <w:tcPr>
-            <w:tcW w:type="dxa" w:w="1505"/>
+            <w:tcW w:type="dxa" w:w="1577"/>
           </w:tcPr>
           <w:p>
             <w:pPr>
@@ -4492,7 +5043,7 @@
         </w:tc>
         <w:tc>
           <w:tcPr>
-            <w:tcW w:type="dxa" w:w="1505"/>
+            <w:tcW w:type="dxa" w:w="1577"/>
           </w:tcPr>
           <w:p>
             <w:pPr>
@@ -4513,7 +5064,7 @@
         </w:tc>
         <w:tc>
           <w:tcPr>
-            <w:tcW w:type="dxa" w:w="1505"/>
+            <w:tcW w:type="dxa" w:w="1577"/>
           </w:tcPr>
           <w:p>
             <w:pPr>
@@ -4534,7 +5085,7 @@
         </w:tc>
         <w:tc>
           <w:tcPr>
-            <w:tcW w:type="dxa" w:w="1505"/>
+            <w:tcW w:type="dxa" w:w="1577"/>
           </w:tcPr>
           <w:p>
             <w:pPr>
@@ -4557,7 +5108,7 @@
       <w:tr>
         <w:tc>
           <w:tcPr>
-            <w:tcW w:type="dxa" w:w="1505"/>
+            <w:tcW w:type="dxa" w:w="1577"/>
           </w:tcPr>
           <w:p>
             <w:pPr>
@@ -4578,7 +5129,7 @@
         </w:tc>
         <w:tc>
           <w:tcPr>
-            <w:tcW w:type="dxa" w:w="1505"/>
+            <w:tcW w:type="dxa" w:w="1577"/>
           </w:tcPr>
           <w:p>
             <w:pPr>
@@ -4599,7 +5150,7 @@
         </w:tc>
         <w:tc>
           <w:tcPr>
-            <w:tcW w:type="dxa" w:w="1505"/>
+            <w:tcW w:type="dxa" w:w="1577"/>
           </w:tcPr>
           <w:p>
             <w:pPr>
@@ -4620,7 +5171,7 @@
         </w:tc>
         <w:tc>
           <w:tcPr>
-            <w:tcW w:type="dxa" w:w="1505"/>
+            <w:tcW w:type="dxa" w:w="1577"/>
           </w:tcPr>
           <w:p>
             <w:pPr>
@@ -4641,7 +5192,7 @@
         </w:tc>
         <w:tc>
           <w:tcPr>
-            <w:tcW w:type="dxa" w:w="1505"/>
+            <w:tcW w:type="dxa" w:w="1577"/>
           </w:tcPr>
           <w:p>
             <w:pPr>
@@ -4662,7 +5213,7 @@
         </w:tc>
         <w:tc>
           <w:tcPr>
-            <w:tcW w:type="dxa" w:w="1505"/>
+            <w:tcW w:type="dxa" w:w="1577"/>
           </w:tcPr>
           <w:p>
             <w:pPr>
@@ -4685,7 +5236,7 @@
       <w:tr>
         <w:tc>
           <w:tcPr>
-            <w:tcW w:type="dxa" w:w="1505"/>
+            <w:tcW w:type="dxa" w:w="1577"/>
           </w:tcPr>
           <w:p>
             <w:pPr>
@@ -4706,7 +5257,7 @@
         </w:tc>
         <w:tc>
           <w:tcPr>
-            <w:tcW w:type="dxa" w:w="1505"/>
+            <w:tcW w:type="dxa" w:w="1577"/>
           </w:tcPr>
           <w:p>
             <w:pPr>
@@ -4727,7 +5278,7 @@
         </w:tc>
         <w:tc>
           <w:tcPr>
-            <w:tcW w:type="dxa" w:w="1505"/>
+            <w:tcW w:type="dxa" w:w="1577"/>
           </w:tcPr>
           <w:p>
             <w:pPr>
@@ -4748,7 +5299,7 @@
         </w:tc>
         <w:tc>
           <w:tcPr>
-            <w:tcW w:type="dxa" w:w="1505"/>
+            <w:tcW w:type="dxa" w:w="1577"/>
           </w:tcPr>
           <w:p>
             <w:pPr>
@@ -4769,7 +5320,7 @@
         </w:tc>
         <w:tc>
           <w:tcPr>
-            <w:tcW w:type="dxa" w:w="1505"/>
+            <w:tcW w:type="dxa" w:w="1577"/>
           </w:tcPr>
           <w:p>
             <w:pPr>
@@ -4790,7 +5341,7 @@
         </w:tc>
         <w:tc>
           <w:tcPr>
-            <w:tcW w:type="dxa" w:w="1505"/>
+            <w:tcW w:type="dxa" w:w="1577"/>
           </w:tcPr>
           <w:p>
             <w:pPr>
@@ -4813,7 +5364,7 @@
       <w:tr>
         <w:tc>
           <w:tcPr>
-            <w:tcW w:type="dxa" w:w="1505"/>
+            <w:tcW w:type="dxa" w:w="1577"/>
           </w:tcPr>
           <w:p>
             <w:pPr>
@@ -4834,7 +5385,7 @@
         </w:tc>
         <w:tc>
           <w:tcPr>
-            <w:tcW w:type="dxa" w:w="1505"/>
+            <w:tcW w:type="dxa" w:w="1577"/>
           </w:tcPr>
           <w:p>
             <w:pPr>
@@ -4855,7 +5406,7 @@
         </w:tc>
         <w:tc>
           <w:tcPr>
-            <w:tcW w:type="dxa" w:w="1505"/>
+            <w:tcW w:type="dxa" w:w="1577"/>
           </w:tcPr>
           <w:p>
             <w:pPr>
@@ -4876,7 +5427,7 @@
         </w:tc>
         <w:tc>
           <w:tcPr>
-            <w:tcW w:type="dxa" w:w="1505"/>
+            <w:tcW w:type="dxa" w:w="1577"/>
           </w:tcPr>
           <w:p>
             <w:pPr>
@@ -4897,7 +5448,7 @@
         </w:tc>
         <w:tc>
           <w:tcPr>
-            <w:tcW w:type="dxa" w:w="1505"/>
+            <w:tcW w:type="dxa" w:w="1577"/>
           </w:tcPr>
           <w:p>
             <w:pPr>
@@ -4918,7 +5469,7 @@
         </w:tc>
         <w:tc>
           <w:tcPr>
-            <w:tcW w:type="dxa" w:w="1505"/>
+            <w:tcW w:type="dxa" w:w="1577"/>
           </w:tcPr>
           <w:p>
             <w:pPr>
@@ -4941,7 +5492,7 @@
       <w:tr>
         <w:tc>
           <w:tcPr>
-            <w:tcW w:type="dxa" w:w="1505"/>
+            <w:tcW w:type="dxa" w:w="1577"/>
           </w:tcPr>
           <w:p>
             <w:pPr>
@@ -4962,7 +5513,7 @@
         </w:tc>
         <w:tc>
           <w:tcPr>
-            <w:tcW w:type="dxa" w:w="1505"/>
+            <w:tcW w:type="dxa" w:w="1577"/>
           </w:tcPr>
           <w:p>
             <w:pPr>
@@ -4983,7 +5534,7 @@
         </w:tc>
         <w:tc>
           <w:tcPr>
-            <w:tcW w:type="dxa" w:w="1505"/>
+            <w:tcW w:type="dxa" w:w="1577"/>
           </w:tcPr>
           <w:p>
             <w:pPr>
@@ -5004,7 +5555,7 @@
         </w:tc>
         <w:tc>
           <w:tcPr>
-            <w:tcW w:type="dxa" w:w="1505"/>
+            <w:tcW w:type="dxa" w:w="1577"/>
           </w:tcPr>
           <w:p>
             <w:pPr>
@@ -5025,7 +5576,7 @@
         </w:tc>
         <w:tc>
           <w:tcPr>
-            <w:tcW w:type="dxa" w:w="1505"/>
+            <w:tcW w:type="dxa" w:w="1577"/>
           </w:tcPr>
           <w:p>
             <w:pPr>
@@ -5046,7 +5597,7 @@
         </w:tc>
         <w:tc>
           <w:tcPr>
-            <w:tcW w:type="dxa" w:w="1505"/>
+            <w:tcW w:type="dxa" w:w="1577"/>
           </w:tcPr>
           <w:p>
             <w:pPr>
@@ -5069,7 +5620,7 @@
       <w:tr>
         <w:tc>
           <w:tcPr>
-            <w:tcW w:type="dxa" w:w="1505"/>
+            <w:tcW w:type="dxa" w:w="1577"/>
           </w:tcPr>
           <w:p>
             <w:pPr>
@@ -5090,7 +5641,7 @@
         </w:tc>
         <w:tc>
           <w:tcPr>
-            <w:tcW w:type="dxa" w:w="1505"/>
+            <w:tcW w:type="dxa" w:w="1577"/>
           </w:tcPr>
           <w:p>
             <w:pPr>
@@ -5111,7 +5662,7 @@
         </w:tc>
         <w:tc>
           <w:tcPr>
-            <w:tcW w:type="dxa" w:w="1505"/>
+            <w:tcW w:type="dxa" w:w="1577"/>
           </w:tcPr>
           <w:p>
             <w:pPr>
@@ -5132,7 +5683,7 @@
         </w:tc>
         <w:tc>
           <w:tcPr>
-            <w:tcW w:type="dxa" w:w="1505"/>
+            <w:tcW w:type="dxa" w:w="1577"/>
           </w:tcPr>
           <w:p>
             <w:pPr>
@@ -5153,7 +5704,7 @@
         </w:tc>
         <w:tc>
           <w:tcPr>
-            <w:tcW w:type="dxa" w:w="1505"/>
+            <w:tcW w:type="dxa" w:w="1577"/>
           </w:tcPr>
           <w:p>
             <w:pPr>
@@ -5174,7 +5725,7 @@
         </w:tc>
         <w:tc>
           <w:tcPr>
-            <w:tcW w:type="dxa" w:w="1505"/>
+            <w:tcW w:type="dxa" w:w="1577"/>
           </w:tcPr>
           <w:p>
             <w:pPr>
@@ -5197,7 +5748,7 @@
       <w:tr>
         <w:tc>
           <w:tcPr>
-            <w:tcW w:type="dxa" w:w="1505"/>
+            <w:tcW w:type="dxa" w:w="1577"/>
           </w:tcPr>
           <w:p>
             <w:pPr>
@@ -5218,7 +5769,7 @@
         </w:tc>
         <w:tc>
           <w:tcPr>
-            <w:tcW w:type="dxa" w:w="1505"/>
+            <w:tcW w:type="dxa" w:w="1577"/>
           </w:tcPr>
           <w:p>
             <w:pPr>
@@ -5239,7 +5790,7 @@
         </w:tc>
         <w:tc>
           <w:tcPr>
-            <w:tcW w:type="dxa" w:w="1505"/>
+            <w:tcW w:type="dxa" w:w="1577"/>
           </w:tcPr>
           <w:p>
             <w:pPr>
@@ -5260,7 +5811,7 @@
         </w:tc>
         <w:tc>
           <w:tcPr>
-            <w:tcW w:type="dxa" w:w="1505"/>
+            <w:tcW w:type="dxa" w:w="1577"/>
           </w:tcPr>
           <w:p>
             <w:pPr>
@@ -5281,7 +5832,7 @@
         </w:tc>
         <w:tc>
           <w:tcPr>
-            <w:tcW w:type="dxa" w:w="1505"/>
+            <w:tcW w:type="dxa" w:w="1577"/>
           </w:tcPr>
           <w:p>
             <w:pPr>
@@ -5302,7 +5853,7 @@
         </w:tc>
         <w:tc>
           <w:tcPr>
-            <w:tcW w:type="dxa" w:w="1505"/>
+            <w:tcW w:type="dxa" w:w="1577"/>
           </w:tcPr>
           <w:p>
             <w:pPr>
@@ -5325,7 +5876,7 @@
       <w:tr>
         <w:tc>
           <w:tcPr>
-            <w:tcW w:type="dxa" w:w="1505"/>
+            <w:tcW w:type="dxa" w:w="1577"/>
           </w:tcPr>
           <w:p>
             <w:pPr>
@@ -5346,7 +5897,7 @@
         </w:tc>
         <w:tc>
           <w:tcPr>
-            <w:tcW w:type="dxa" w:w="1505"/>
+            <w:tcW w:type="dxa" w:w="1577"/>
           </w:tcPr>
           <w:p>
             <w:pPr>
@@ -5367,7 +5918,7 @@
         </w:tc>
         <w:tc>
           <w:tcPr>
-            <w:tcW w:type="dxa" w:w="1505"/>
+            <w:tcW w:type="dxa" w:w="1577"/>
           </w:tcPr>
           <w:p>
             <w:pPr>
@@ -5388,7 +5939,7 @@
         </w:tc>
         <w:tc>
           <w:tcPr>
-            <w:tcW w:type="dxa" w:w="1505"/>
+            <w:tcW w:type="dxa" w:w="1577"/>
           </w:tcPr>
           <w:p>
             <w:pPr>
@@ -5409,7 +5960,7 @@
         </w:tc>
         <w:tc>
           <w:tcPr>
-            <w:tcW w:type="dxa" w:w="1505"/>
+            <w:tcW w:type="dxa" w:w="1577"/>
           </w:tcPr>
           <w:p>
             <w:pPr>
@@ -5430,7 +5981,7 @@
         </w:tc>
         <w:tc>
           <w:tcPr>
-            <w:tcW w:type="dxa" w:w="1505"/>
+            <w:tcW w:type="dxa" w:w="1577"/>
           </w:tcPr>
           <w:p>
             <w:pPr>
@@ -5453,7 +6004,7 @@
       <w:tr>
         <w:tc>
           <w:tcPr>
-            <w:tcW w:type="dxa" w:w="1505"/>
+            <w:tcW w:type="dxa" w:w="1577"/>
           </w:tcPr>
           <w:p>
             <w:pPr>
@@ -5474,7 +6025,7 @@
         </w:tc>
         <w:tc>
           <w:tcPr>
-            <w:tcW w:type="dxa" w:w="1505"/>
+            <w:tcW w:type="dxa" w:w="1577"/>
           </w:tcPr>
           <w:p>
             <w:pPr>
@@ -5495,7 +6046,7 @@
         </w:tc>
         <w:tc>
           <w:tcPr>
-            <w:tcW w:type="dxa" w:w="1505"/>
+            <w:tcW w:type="dxa" w:w="1577"/>
           </w:tcPr>
           <w:p>
             <w:pPr>
@@ -5516,7 +6067,7 @@
         </w:tc>
         <w:tc>
           <w:tcPr>
-            <w:tcW w:type="dxa" w:w="1505"/>
+            <w:tcW w:type="dxa" w:w="1577"/>
           </w:tcPr>
           <w:p>
             <w:pPr>
@@ -5537,7 +6088,7 @@
         </w:tc>
         <w:tc>
           <w:tcPr>
-            <w:tcW w:type="dxa" w:w="1505"/>
+            <w:tcW w:type="dxa" w:w="1577"/>
           </w:tcPr>
           <w:p>
             <w:pPr>
@@ -5558,7 +6109,7 @@
         </w:tc>
         <w:tc>
           <w:tcPr>
-            <w:tcW w:type="dxa" w:w="1505"/>
+            <w:tcW w:type="dxa" w:w="1577"/>
           </w:tcPr>
           <w:p>
             <w:pPr>
@@ -5581,7 +6132,7 @@
       <w:tr>
         <w:tc>
           <w:tcPr>
-            <w:tcW w:type="dxa" w:w="1505"/>
+            <w:tcW w:type="dxa" w:w="1577"/>
           </w:tcPr>
           <w:p>
             <w:pPr>
@@ -5602,7 +6153,7 @@
         </w:tc>
         <w:tc>
           <w:tcPr>
-            <w:tcW w:type="dxa" w:w="1505"/>
+            <w:tcW w:type="dxa" w:w="1577"/>
           </w:tcPr>
           <w:p>
             <w:pPr>
@@ -5623,7 +6174,7 @@
         </w:tc>
         <w:tc>
           <w:tcPr>
-            <w:tcW w:type="dxa" w:w="1505"/>
+            <w:tcW w:type="dxa" w:w="1577"/>
           </w:tcPr>
           <w:p>
             <w:pPr>
@@ -5644,7 +6195,7 @@
         </w:tc>
         <w:tc>
           <w:tcPr>
-            <w:tcW w:type="dxa" w:w="1505"/>
+            <w:tcW w:type="dxa" w:w="1577"/>
           </w:tcPr>
           <w:p>
             <w:pPr>
@@ -5665,7 +6216,7 @@
         </w:tc>
         <w:tc>
           <w:tcPr>
-            <w:tcW w:type="dxa" w:w="1505"/>
+            <w:tcW w:type="dxa" w:w="1577"/>
           </w:tcPr>
           <w:p>
             <w:pPr>
@@ -5686,7 +6237,7 @@
         </w:tc>
         <w:tc>
           <w:tcPr>
-            <w:tcW w:type="dxa" w:w="1505"/>
+            <w:tcW w:type="dxa" w:w="1577"/>
           </w:tcPr>
           <w:p>
             <w:pPr>
@@ -5709,7 +6260,7 @@
       <w:tr>
         <w:tc>
           <w:tcPr>
-            <w:tcW w:type="dxa" w:w="1505"/>
+            <w:tcW w:type="dxa" w:w="1577"/>
           </w:tcPr>
           <w:p>
             <w:pPr>
@@ -5730,7 +6281,7 @@
         </w:tc>
         <w:tc>
           <w:tcPr>
-            <w:tcW w:type="dxa" w:w="1505"/>
+            <w:tcW w:type="dxa" w:w="1577"/>
           </w:tcPr>
           <w:p>
             <w:pPr>
@@ -5751,7 +6302,7 @@
         </w:tc>
         <w:tc>
           <w:tcPr>
-            <w:tcW w:type="dxa" w:w="1505"/>
+            <w:tcW w:type="dxa" w:w="1577"/>
           </w:tcPr>
           <w:p>
             <w:pPr>
@@ -5772,7 +6323,7 @@
         </w:tc>
         <w:tc>
           <w:tcPr>
-            <w:tcW w:type="dxa" w:w="1505"/>
+            <w:tcW w:type="dxa" w:w="1577"/>
           </w:tcPr>
           <w:p>
             <w:pPr>
@@ -5793,7 +6344,7 @@
         </w:tc>
         <w:tc>
           <w:tcPr>
-            <w:tcW w:type="dxa" w:w="1505"/>
+            <w:tcW w:type="dxa" w:w="1577"/>
           </w:tcPr>
           <w:p>
             <w:pPr>
@@ -5814,7 +6365,7 @@
         </w:tc>
         <w:tc>
           <w:tcPr>
-            <w:tcW w:type="dxa" w:w="1505"/>
+            <w:tcW w:type="dxa" w:w="1577"/>
           </w:tcPr>
           <w:p>
             <w:pPr>
@@ -5837,7 +6388,7 @@
       <w:tr>
         <w:tc>
           <w:tcPr>
-            <w:tcW w:type="dxa" w:w="1505"/>
+            <w:tcW w:type="dxa" w:w="1577"/>
           </w:tcPr>
           <w:p>
             <w:pPr>
@@ -5858,7 +6409,7 @@
         </w:tc>
         <w:tc>
           <w:tcPr>
-            <w:tcW w:type="dxa" w:w="1505"/>
+            <w:tcW w:type="dxa" w:w="1577"/>
           </w:tcPr>
           <w:p>
             <w:pPr>
@@ -5879,7 +6430,7 @@
         </w:tc>
         <w:tc>
           <w:tcPr>
-            <w:tcW w:type="dxa" w:w="1505"/>
+            <w:tcW w:type="dxa" w:w="1577"/>
           </w:tcPr>
           <w:p>
             <w:pPr>
@@ -5900,7 +6451,7 @@
         </w:tc>
         <w:tc>
           <w:tcPr>
-            <w:tcW w:type="dxa" w:w="1505"/>
+            <w:tcW w:type="dxa" w:w="1577"/>
           </w:tcPr>
           <w:p>
             <w:pPr>
@@ -5921,7 +6472,7 @@
         </w:tc>
         <w:tc>
           <w:tcPr>
-            <w:tcW w:type="dxa" w:w="1505"/>
+            <w:tcW w:type="dxa" w:w="1577"/>
           </w:tcPr>
           <w:p>
             <w:pPr>
@@ -5942,7 +6493,7 @@
         </w:tc>
         <w:tc>
           <w:tcPr>
-            <w:tcW w:type="dxa" w:w="1505"/>
+            <w:tcW w:type="dxa" w:w="1577"/>
           </w:tcPr>
           <w:p>
             <w:pPr>
@@ -5965,7 +6516,7 @@
       <w:tr>
         <w:tc>
           <w:tcPr>
-            <w:tcW w:type="dxa" w:w="1505"/>
+            <w:tcW w:type="dxa" w:w="1577"/>
           </w:tcPr>
           <w:p>
             <w:pPr>
@@ -5986,7 +6537,7 @@
         </w:tc>
         <w:tc>
           <w:tcPr>
-            <w:tcW w:type="dxa" w:w="1505"/>
+            <w:tcW w:type="dxa" w:w="1577"/>
           </w:tcPr>
           <w:p>
             <w:pPr>
@@ -6007,7 +6558,7 @@
         </w:tc>
         <w:tc>
           <w:tcPr>
-            <w:tcW w:type="dxa" w:w="1505"/>
+            <w:tcW w:type="dxa" w:w="1577"/>
           </w:tcPr>
           <w:p>
             <w:pPr>
@@ -6028,7 +6579,7 @@
         </w:tc>
         <w:tc>
           <w:tcPr>
-            <w:tcW w:type="dxa" w:w="1505"/>
+            <w:tcW w:type="dxa" w:w="1577"/>
           </w:tcPr>
           <w:p>
             <w:pPr>
@@ -6049,7 +6600,7 @@
         </w:tc>
         <w:tc>
           <w:tcPr>
-            <w:tcW w:type="dxa" w:w="1505"/>
+            <w:tcW w:type="dxa" w:w="1577"/>
           </w:tcPr>
           <w:p>
             <w:pPr>
@@ -6070,7 +6621,7 @@
         </w:tc>
         <w:tc>
           <w:tcPr>
-            <w:tcW w:type="dxa" w:w="1505"/>
+            <w:tcW w:type="dxa" w:w="1577"/>
           </w:tcPr>
           <w:p>
             <w:pPr>
@@ -6093,7 +6644,7 @@
       <w:tr>
         <w:tc>
           <w:tcPr>
-            <w:tcW w:type="dxa" w:w="1505"/>
+            <w:tcW w:type="dxa" w:w="1577"/>
           </w:tcPr>
           <w:p>
             <w:pPr>
@@ -6114,7 +6665,7 @@
         </w:tc>
         <w:tc>
           <w:tcPr>
-            <w:tcW w:type="dxa" w:w="1505"/>
+            <w:tcW w:type="dxa" w:w="1577"/>
           </w:tcPr>
           <w:p>
             <w:pPr>
@@ -6135,7 +6686,7 @@
         </w:tc>
         <w:tc>
           <w:tcPr>
-            <w:tcW w:type="dxa" w:w="1505"/>
+            <w:tcW w:type="dxa" w:w="1577"/>
           </w:tcPr>
           <w:p>
             <w:pPr>
@@ -6156,7 +6707,7 @@
         </w:tc>
         <w:tc>
           <w:tcPr>
-            <w:tcW w:type="dxa" w:w="1505"/>
+            <w:tcW w:type="dxa" w:w="1577"/>
           </w:tcPr>
           <w:p>
             <w:pPr>
@@ -6177,7 +6728,7 @@
         </w:tc>
         <w:tc>
           <w:tcPr>
-            <w:tcW w:type="dxa" w:w="1505"/>
+            <w:tcW w:type="dxa" w:w="1577"/>
           </w:tcPr>
           <w:p>
             <w:pPr>
@@ -6198,7 +6749,7 @@
         </w:tc>
         <w:tc>
           <w:tcPr>
-            <w:tcW w:type="dxa" w:w="1505"/>
+            <w:tcW w:type="dxa" w:w="1577"/>
           </w:tcPr>
           <w:p>
             <w:pPr>
@@ -6221,7 +6772,7 @@
       <w:tr>
         <w:tc>
           <w:tcPr>
-            <w:tcW w:type="dxa" w:w="1505"/>
+            <w:tcW w:type="dxa" w:w="1577"/>
           </w:tcPr>
           <w:p>
             <w:pPr>
@@ -6242,7 +6793,7 @@
         </w:tc>
         <w:tc>
           <w:tcPr>
-            <w:tcW w:type="dxa" w:w="1505"/>
+            <w:tcW w:type="dxa" w:w="1577"/>
           </w:tcPr>
           <w:p>
             <w:pPr>
@@ -6263,7 +6814,7 @@
         </w:tc>
         <w:tc>
           <w:tcPr>
-            <w:tcW w:type="dxa" w:w="1505"/>
+            <w:tcW w:type="dxa" w:w="1577"/>
           </w:tcPr>
           <w:p>
             <w:pPr>
@@ -6284,7 +6835,7 @@
         </w:tc>
         <w:tc>
           <w:tcPr>
-            <w:tcW w:type="dxa" w:w="1505"/>
+            <w:tcW w:type="dxa" w:w="1577"/>
           </w:tcPr>
           <w:p>
             <w:pPr>
@@ -6305,7 +6856,7 @@
         </w:tc>
         <w:tc>
           <w:tcPr>
-            <w:tcW w:type="dxa" w:w="1505"/>
+            <w:tcW w:type="dxa" w:w="1577"/>
           </w:tcPr>
           <w:p>
             <w:pPr>
@@ -6326,7 +6877,7 @@
         </w:tc>
         <w:tc>
           <w:tcPr>
-            <w:tcW w:type="dxa" w:w="1505"/>
+            <w:tcW w:type="dxa" w:w="1577"/>
           </w:tcPr>
           <w:p>
             <w:pPr>
@@ -6349,7 +6900,7 @@
       <w:tr>
         <w:tc>
           <w:tcPr>
-            <w:tcW w:type="dxa" w:w="1505"/>
+            <w:tcW w:type="dxa" w:w="1577"/>
           </w:tcPr>
           <w:p>
             <w:pPr>
@@ -6370,7 +6921,7 @@
         </w:tc>
         <w:tc>
           <w:tcPr>
-            <w:tcW w:type="dxa" w:w="1505"/>
+            <w:tcW w:type="dxa" w:w="1577"/>
           </w:tcPr>
           <w:p>
             <w:pPr>
@@ -6391,7 +6942,7 @@
         </w:tc>
         <w:tc>
           <w:tcPr>
-            <w:tcW w:type="dxa" w:w="1505"/>
+            <w:tcW w:type="dxa" w:w="1577"/>
           </w:tcPr>
           <w:p>
             <w:pPr>
@@ -6412,7 +6963,7 @@
         </w:tc>
         <w:tc>
           <w:tcPr>
-            <w:tcW w:type="dxa" w:w="1505"/>
+            <w:tcW w:type="dxa" w:w="1577"/>
           </w:tcPr>
           <w:p>
             <w:pPr>
@@ -6433,7 +6984,7 @@
         </w:tc>
         <w:tc>
           <w:tcPr>
-            <w:tcW w:type="dxa" w:w="1505"/>
+            <w:tcW w:type="dxa" w:w="1577"/>
           </w:tcPr>
           <w:p>
             <w:pPr>
@@ -6454,7 +7005,7 @@
         </w:tc>
         <w:tc>
           <w:tcPr>
-            <w:tcW w:type="dxa" w:w="1505"/>
+            <w:tcW w:type="dxa" w:w="1577"/>
           </w:tcPr>
           <w:p>
             <w:pPr>
@@ -6478,8 +7029,8 @@
     <w:p/>
     <w:p>
       <w:pPr>
-        <w:spacing w:after="160" w:before="0" w:line="360" w:lineRule="auto"/>
-        <w:ind w:firstLine="432"/>
+        <w:spacing w:after="80" w:before="0" w:line="259" w:lineRule="auto"/>
+        <w:ind w:firstLine="288"/>
         <w:jc w:val="both"/>
       </w:pPr>
       <w:r>
@@ -6501,7 +7052,7 @@
       <w:r>
         <w:drawing>
           <wp:inline xmlns:a="http://schemas.openxmlformats.org/drawingml/2006/main" xmlns:pic="http://schemas.openxmlformats.org/drawingml/2006/picture">
-            <wp:extent cx="5760720" cy="3560848"/>
+            <wp:extent cx="5120640" cy="3165198"/>
             <wp:docPr id="13" name="Picture 13"/>
             <wp:cNvGraphicFramePr>
               <a:graphicFrameLocks noChangeAspect="1"/>
@@ -6522,7 +7073,7 @@
                   <pic:spPr>
                     <a:xfrm>
                       <a:off x="0" y="0"/>
-                      <a:ext cx="5760720" cy="3560848"/>
+                      <a:ext cx="5120640" cy="3165198"/>
                     </a:xfrm>
                     <a:prstGeom prst="rect"/>
                   </pic:spPr>
@@ -6552,8 +7103,8 @@
     </w:p>
     <w:p>
       <w:pPr>
-        <w:spacing w:after="160" w:before="0" w:line="360" w:lineRule="auto"/>
-        <w:ind w:firstLine="432"/>
+        <w:spacing w:after="80" w:before="0" w:line="259" w:lineRule="auto"/>
+        <w:ind w:firstLine="288"/>
         <w:jc w:val="both"/>
       </w:pPr>
       <w:r>
@@ -6575,7 +7126,7 @@
       <w:r>
         <w:drawing>
           <wp:inline xmlns:a="http://schemas.openxmlformats.org/drawingml/2006/main" xmlns:pic="http://schemas.openxmlformats.org/drawingml/2006/picture">
-            <wp:extent cx="5760720" cy="4360545"/>
+            <wp:extent cx="4348852" cy="3291839"/>
             <wp:docPr id="14" name="Picture 14"/>
             <wp:cNvGraphicFramePr>
               <a:graphicFrameLocks noChangeAspect="1"/>
@@ -6596,7 +7147,7 @@
                   <pic:spPr>
                     <a:xfrm>
                       <a:off x="0" y="0"/>
-                      <a:ext cx="5760720" cy="4360545"/>
+                      <a:ext cx="4348852" cy="3291839"/>
                     </a:xfrm>
                     <a:prstGeom prst="rect"/>
                   </pic:spPr>
@@ -6626,8 +7177,8 @@
     </w:p>
     <w:p>
       <w:pPr>
-        <w:spacing w:after="160" w:before="0" w:line="360" w:lineRule="auto"/>
-        <w:ind w:firstLine="432"/>
+        <w:spacing w:after="80" w:before="0" w:line="259" w:lineRule="auto"/>
+        <w:ind w:firstLine="288"/>
         <w:jc w:val="both"/>
       </w:pPr>
       <w:r>
@@ -6664,14 +7215,14 @@
         <w:tblLook w:firstColumn="1" w:firstRow="1" w:lastColumn="0" w:lastRow="0" w:noHBand="0" w:noVBand="1" w:val="04A0"/>
       </w:tblPr>
       <w:tblGrid>
-        <w:gridCol w:w="3010"/>
-        <w:gridCol w:w="3010"/>
-        <w:gridCol w:w="3010"/>
+        <w:gridCol w:w="3154"/>
+        <w:gridCol w:w="3154"/>
+        <w:gridCol w:w="3154"/>
       </w:tblGrid>
       <w:tr>
         <w:tc>
           <w:tcPr>
-            <w:tcW w:type="dxa" w:w="3010"/>
+            <w:tcW w:type="dxa" w:w="3154"/>
             <w:shd w:fill="1F4E79" w:val="clear"/>
           </w:tcPr>
           <w:p>
@@ -6698,7 +7249,7 @@
         </w:tc>
         <w:tc>
           <w:tcPr>
-            <w:tcW w:type="dxa" w:w="3010"/>
+            <w:tcW w:type="dxa" w:w="3154"/>
             <w:shd w:fill="1F4E79" w:val="clear"/>
           </w:tcPr>
           <w:p>
@@ -6725,7 +7276,7 @@
         </w:tc>
         <w:tc>
           <w:tcPr>
-            <w:tcW w:type="dxa" w:w="3010"/>
+            <w:tcW w:type="dxa" w:w="3154"/>
             <w:shd w:fill="1F4E79" w:val="clear"/>
           </w:tcPr>
           <w:p>
@@ -6754,7 +7305,7 @@
       <w:tr>
         <w:tc>
           <w:tcPr>
-            <w:tcW w:type="dxa" w:w="3010"/>
+            <w:tcW w:type="dxa" w:w="3154"/>
           </w:tcPr>
           <w:p>
             <w:pPr>
@@ -6775,7 +7326,7 @@
         </w:tc>
         <w:tc>
           <w:tcPr>
-            <w:tcW w:type="dxa" w:w="3010"/>
+            <w:tcW w:type="dxa" w:w="3154"/>
           </w:tcPr>
           <w:p>
             <w:pPr>
@@ -6796,7 +7347,7 @@
         </w:tc>
         <w:tc>
           <w:tcPr>
-            <w:tcW w:type="dxa" w:w="3010"/>
+            <w:tcW w:type="dxa" w:w="3154"/>
           </w:tcPr>
           <w:p>
             <w:pPr>
@@ -6819,7 +7370,7 @@
       <w:tr>
         <w:tc>
           <w:tcPr>
-            <w:tcW w:type="dxa" w:w="3010"/>
+            <w:tcW w:type="dxa" w:w="3154"/>
           </w:tcPr>
           <w:p>
             <w:pPr>
@@ -6840,7 +7391,7 @@
         </w:tc>
         <w:tc>
           <w:tcPr>
-            <w:tcW w:type="dxa" w:w="3010"/>
+            <w:tcW w:type="dxa" w:w="3154"/>
           </w:tcPr>
           <w:p>
             <w:pPr>
@@ -6861,7 +7412,7 @@
         </w:tc>
         <w:tc>
           <w:tcPr>
-            <w:tcW w:type="dxa" w:w="3010"/>
+            <w:tcW w:type="dxa" w:w="3154"/>
           </w:tcPr>
           <w:p>
             <w:pPr>
@@ -6885,8 +7436,8 @@
     <w:p/>
     <w:p>
       <w:pPr>
-        <w:spacing w:after="160" w:before="0" w:line="360" w:lineRule="auto"/>
-        <w:ind w:firstLine="432"/>
+        <w:spacing w:after="80" w:before="0" w:line="259" w:lineRule="auto"/>
+        <w:ind w:firstLine="288"/>
         <w:jc w:val="both"/>
       </w:pPr>
       <w:r>
@@ -6907,7 +7458,7 @@
     </w:p>
     <w:p>
       <w:pPr>
-        <w:spacing w:before="240" w:after="160" w:line="276" w:lineRule="auto"/>
+        <w:spacing w:before="160" w:after="80" w:line="240" w:lineRule="auto"/>
         <w:ind w:firstLine="0"/>
         <w:jc w:val="left"/>
       </w:pPr>
@@ -6917,15 +7468,15 @@
           <w:b/>
           <w:i w:val="0"/>
           <w:color w:val="000000"/>
-          <w:sz w:val="32"/>
+          <w:sz w:val="28"/>
         </w:rPr>
         <w:t>CHAPTER 5  CONCLUSION</w:t>
       </w:r>
     </w:p>
     <w:p>
       <w:pPr>
-        <w:spacing w:after="160" w:before="0" w:line="360" w:lineRule="auto"/>
-        <w:ind w:firstLine="432"/>
+        <w:spacing w:after="80" w:before="0" w:line="259" w:lineRule="auto"/>
+        <w:ind w:firstLine="288"/>
         <w:jc w:val="both"/>
       </w:pPr>
       <w:r>
@@ -6941,8 +7492,8 @@
     </w:p>
     <w:p>
       <w:pPr>
-        <w:spacing w:after="160" w:before="0" w:line="360" w:lineRule="auto"/>
-        <w:ind w:firstLine="432"/>
+        <w:spacing w:after="80" w:before="0" w:line="259" w:lineRule="auto"/>
+        <w:ind w:firstLine="288"/>
         <w:jc w:val="both"/>
       </w:pPr>
       <w:r>
@@ -6963,7 +7514,7 @@
     </w:p>
     <w:p>
       <w:pPr>
-        <w:spacing w:before="240" w:after="160" w:line="276" w:lineRule="auto"/>
+        <w:spacing w:before="160" w:after="80" w:line="240" w:lineRule="auto"/>
         <w:ind w:firstLine="0"/>
         <w:jc w:val="left"/>
       </w:pPr>
@@ -6973,14 +7524,14 @@
           <w:b/>
           <w:i w:val="0"/>
           <w:color w:val="000000"/>
-          <w:sz w:val="32"/>
+          <w:sz w:val="28"/>
         </w:rPr>
         <w:t>REFERENCES</w:t>
       </w:r>
     </w:p>
     <w:p>
       <w:pPr>
-        <w:spacing w:after="120" w:before="0" w:line="360" w:lineRule="auto"/>
+        <w:spacing w:after="120" w:before="0" w:line="259" w:lineRule="auto"/>
         <w:jc w:val="both"/>
       </w:pPr>
       <w:r>
@@ -6996,7 +7547,7 @@
     </w:p>
     <w:p>
       <w:pPr>
-        <w:spacing w:after="120" w:before="0" w:line="360" w:lineRule="auto"/>
+        <w:spacing w:after="120" w:before="0" w:line="259" w:lineRule="auto"/>
         <w:jc w:val="both"/>
       </w:pPr>
       <w:r>
@@ -7012,7 +7563,7 @@
     </w:p>
     <w:p>
       <w:pPr>
-        <w:spacing w:after="120" w:before="0" w:line="360" w:lineRule="auto"/>
+        <w:spacing w:after="120" w:before="0" w:line="259" w:lineRule="auto"/>
         <w:jc w:val="both"/>
       </w:pPr>
       <w:r>
@@ -7028,7 +7579,7 @@
     </w:p>
     <w:p>
       <w:pPr>
-        <w:spacing w:after="120" w:before="0" w:line="360" w:lineRule="auto"/>
+        <w:spacing w:after="120" w:before="0" w:line="259" w:lineRule="auto"/>
         <w:jc w:val="both"/>
       </w:pPr>
       <w:r>
@@ -7044,7 +7595,7 @@
     </w:p>
     <w:p>
       <w:pPr>
-        <w:spacing w:after="120" w:before="0" w:line="360" w:lineRule="auto"/>
+        <w:spacing w:after="120" w:before="0" w:line="259" w:lineRule="auto"/>
         <w:jc w:val="both"/>
       </w:pPr>
       <w:r>
@@ -7055,12 +7606,12 @@
           <w:color w:val="000000"/>
           <w:sz w:val="24"/>
         </w:rPr>
-        <w:t>[5] GroupLens, “MovieLens 32M dataset,” https://grouplens.org/datasets/movielens/.</w:t>
+        <w:t>[5] C. A. Gomez-Uribe and N. Hunt, “The Netflix recommender system: Algorithms, business value, and innovation,” ACM Transactions on Management Information Systems, vol. 6, no. 4, article 13, 2016.</w:t>
       </w:r>
     </w:p>
     <w:p>
       <w:pPr>
-        <w:spacing w:after="120" w:before="0" w:line="360" w:lineRule="auto"/>
+        <w:spacing w:after="120" w:before="0" w:line="259" w:lineRule="auto"/>
         <w:jc w:val="both"/>
       </w:pPr>
       <w:r>
@@ -7071,7 +7622,23 @@
           <w:color w:val="000000"/>
           <w:sz w:val="24"/>
         </w:rPr>
-        <w:t>[6] The Movie Database, “Movie watch providers,” API reference, https://developer.themoviedb.org/reference/movie-watch-providers.</w:t>
+        <w:t>[6] GroupLens, “MovieLens 32M dataset,” https://grouplens.org/datasets/movielens/.</w:t>
+      </w:r>
+    </w:p>
+    <w:p>
+      <w:pPr>
+        <w:spacing w:after="120" w:before="0" w:line="259" w:lineRule="auto"/>
+        <w:jc w:val="both"/>
+      </w:pPr>
+      <w:r>
+        <w:rPr>
+          <w:rFonts w:ascii="Times New Roman" w:hAnsi="Times New Roman" w:eastAsia="Times New Roman"/>
+          <w:b w:val="0"/>
+          <w:i w:val="0"/>
+          <w:color w:val="000000"/>
+          <w:sz w:val="24"/>
+        </w:rPr>
+        <w:t>[7] The Movie Database, “Movie watch providers,” API reference, https://developer.themoviedb.org/reference/movie-watch-providers.</w:t>
       </w:r>
     </w:p>
     <w:p>
@@ -7081,7 +7648,7 @@
     </w:p>
     <w:p>
       <w:pPr>
-        <w:spacing w:before="240" w:after="160" w:line="276" w:lineRule="auto"/>
+        <w:spacing w:before="160" w:after="80" w:line="240" w:lineRule="auto"/>
         <w:ind w:firstLine="0"/>
         <w:jc w:val="left"/>
       </w:pPr>
@@ -7091,14 +7658,14 @@
           <w:b/>
           <w:i w:val="0"/>
           <w:color w:val="000000"/>
-          <w:sz w:val="32"/>
+          <w:sz w:val="28"/>
         </w:rPr>
         <w:t>APPENDIX  COMMANDS AND QUERIES</w:t>
       </w:r>
     </w:p>
     <w:p>
       <w:pPr>
-        <w:spacing w:after="160" w:before="0" w:line="360" w:lineRule="auto"/>
+        <w:spacing w:after="80" w:before="0" w:line="259" w:lineRule="auto"/>
         <w:jc w:val="both"/>
       </w:pPr>
       <w:r>
@@ -7114,7 +7681,7 @@
     </w:p>
     <w:p>
       <w:pPr>
-        <w:spacing w:after="0" w:before="0" w:line="360" w:lineRule="auto"/>
+        <w:spacing w:after="0" w:before="0" w:line="259" w:lineRule="auto"/>
         <w:jc w:val="both"/>
       </w:pPr>
       <w:r>
@@ -7130,7 +7697,7 @@
     </w:p>
     <w:p>
       <w:pPr>
-        <w:spacing w:after="0" w:before="0" w:line="360" w:lineRule="auto"/>
+        <w:spacing w:after="0" w:before="0" w:line="259" w:lineRule="auto"/>
         <w:jc w:val="both"/>
       </w:pPr>
       <w:r>
@@ -7146,7 +7713,7 @@
     </w:p>
     <w:p>
       <w:pPr>
-        <w:spacing w:after="0" w:before="0" w:line="360" w:lineRule="auto"/>
+        <w:spacing w:after="0" w:before="0" w:line="259" w:lineRule="auto"/>
         <w:jc w:val="both"/>
       </w:pPr>
       <w:r>
@@ -7162,7 +7729,7 @@
     </w:p>
     <w:p>
       <w:pPr>
-        <w:spacing w:after="0" w:before="0" w:line="360" w:lineRule="auto"/>
+        <w:spacing w:after="0" w:before="0" w:line="259" w:lineRule="auto"/>
         <w:jc w:val="both"/>
       </w:pPr>
       <w:r>
@@ -7178,7 +7745,7 @@
     </w:p>
     <w:p>
       <w:pPr>
-        <w:spacing w:after="160" w:before="0" w:line="360" w:lineRule="auto"/>
+        <w:spacing w:after="80" w:before="0" w:line="259" w:lineRule="auto"/>
         <w:jc w:val="both"/>
       </w:pPr>
       <w:r>
@@ -7194,7 +7761,7 @@
     </w:p>
     <w:p>
       <w:pPr>
-        <w:spacing w:after="0" w:before="0" w:line="360" w:lineRule="auto"/>
+        <w:spacing w:after="0" w:before="0" w:line="259" w:lineRule="auto"/>
         <w:jc w:val="both"/>
       </w:pPr>
       <w:r>
@@ -7210,7 +7777,7 @@
     </w:p>
     <w:p>
       <w:pPr>
-        <w:spacing w:after="0" w:before="0" w:line="360" w:lineRule="auto"/>
+        <w:spacing w:after="0" w:before="0" w:line="259" w:lineRule="auto"/>
         <w:jc w:val="both"/>
       </w:pPr>
       <w:r>
@@ -7226,7 +7793,7 @@
     </w:p>
     <w:p>
       <w:pPr>
-        <w:spacing w:after="0" w:before="0" w:line="360" w:lineRule="auto"/>
+        <w:spacing w:after="0" w:before="0" w:line="259" w:lineRule="auto"/>
         <w:jc w:val="both"/>
       </w:pPr>
       <w:r>
@@ -7242,7 +7809,7 @@
     </w:p>
     <w:p>
       <w:pPr>
-        <w:spacing w:after="160" w:before="0" w:line="360" w:lineRule="auto"/>
+        <w:spacing w:after="80" w:before="0" w:line="259" w:lineRule="auto"/>
         <w:jc w:val="both"/>
       </w:pPr>
       <w:r>
@@ -7258,7 +7825,7 @@
     </w:p>
     <w:p>
       <w:pPr>
-        <w:spacing w:after="40" w:before="0" w:line="360" w:lineRule="auto"/>
+        <w:spacing w:after="40" w:before="0" w:line="259" w:lineRule="auto"/>
         <w:jc w:val="both"/>
       </w:pPr>
       <w:r>
@@ -7274,7 +7841,7 @@
     </w:p>
     <w:p>
       <w:pPr>
-        <w:spacing w:after="160" w:before="0" w:line="360" w:lineRule="auto"/>
+        <w:spacing w:after="80" w:before="0" w:line="259" w:lineRule="auto"/>
         <w:jc w:val="both"/>
       </w:pPr>
       <w:r>
@@ -7291,7 +7858,7 @@
     <w:sectPr>
       <w:footerReference w:type="default" r:id="rId9"/>
       <w:pgSz w:w="11909" w:h="16834"/>
-      <w:pgMar w:top="1296" w:right="1440" w:bottom="1152" w:left="1440" w:header="720" w:footer="720" w:gutter="0"/>
+      <w:pgMar w:top="1008" w:right="1224" w:bottom="864" w:left="1224" w:header="720" w:footer="720" w:gutter="0"/>
       <w:cols w:space="720"/>
       <w:docGrid w:linePitch="360"/>
     </w:sectPr>

</xml_diff>